<commit_message>
Add documentation for backend development, SQL Server, and third-party services integration
</commit_message>
<xml_diff>
--- a/docs/techniques tools/techniques tools.docx
+++ b/docs/techniques tools/techniques tools.docx
@@ -1840,6 +1840,24 @@
           <w:lang w:val="en-US"/>
         </w:rPr>
       </w:pPr>
+    </w:p>
+    <w:p>
+      <w:pPr>
+        <w:numPr>
+          <w:ilvl w:val="0"/>
+          <w:numId w:val="2"/>
+        </w:numPr>
+        <w:ind w:left="0" w:leftChars="0" w:firstLine="0" w:firstLineChars="0"/>
+        <w:jc w:val="left"/>
+        <w:rPr>
+          <w:rFonts w:hint="default" w:ascii="Calibri" w:hAnsi="Calibri"/>
+          <w:b/>
+          <w:bCs/>
+          <w:sz w:val="28"/>
+          <w:szCs w:val="28"/>
+          <w:lang w:val="en-US"/>
+        </w:rPr>
+      </w:pPr>
       <w:r>
         <w:rPr>
           <w:rFonts w:ascii="SimSun" w:hAnsi="SimSun" w:eastAsia="SimSun" w:cs="SimSun"/>
@@ -1850,10 +1868,10 @@
           <wp:anchor distT="0" distB="0" distL="114300" distR="114300" simplePos="0" relativeHeight="251664384" behindDoc="1" locked="0" layoutInCell="1" allowOverlap="1">
             <wp:simplePos x="0" y="0"/>
             <wp:positionH relativeFrom="column">
-              <wp:posOffset>5275580</wp:posOffset>
+              <wp:posOffset>5307330</wp:posOffset>
             </wp:positionH>
             <wp:positionV relativeFrom="paragraph">
-              <wp:posOffset>85090</wp:posOffset>
+              <wp:posOffset>217170</wp:posOffset>
             </wp:positionV>
             <wp:extent cx="1350645" cy="1444625"/>
             <wp:effectExtent l="0" t="0" r="0" b="0"/>
@@ -1923,24 +1941,6 @@
           </wp:anchor>
         </w:drawing>
       </w:r>
-    </w:p>
-    <w:p>
-      <w:pPr>
-        <w:numPr>
-          <w:ilvl w:val="0"/>
-          <w:numId w:val="2"/>
-        </w:numPr>
-        <w:ind w:left="0" w:leftChars="0" w:firstLine="0" w:firstLineChars="0"/>
-        <w:jc w:val="left"/>
-        <w:rPr>
-          <w:rFonts w:hint="default" w:ascii="Calibri" w:hAnsi="Calibri"/>
-          <w:b/>
-          <w:bCs/>
-          <w:sz w:val="28"/>
-          <w:szCs w:val="28"/>
-          <w:lang w:val="en-US"/>
-        </w:rPr>
-      </w:pPr>
       <w:r>
         <w:rPr>
           <w:rFonts w:hint="default" w:ascii="Calibri" w:hAnsi="Calibri"/>
@@ -2645,6 +2645,8 @@
           <w:lang w:val="en-US"/>
         </w:rPr>
       </w:pPr>
+      <w:bookmarkStart w:id="0" w:name="_GoBack"/>
+      <w:bookmarkEnd w:id="0"/>
     </w:p>
     <w:p>
       <w:pPr>
@@ -3517,6 +3519,7 @@
     <w:p>
       <w:pPr>
         <w:numPr>
+          <w:ilvl w:val="0"/>
           <w:numId w:val="0"/>
         </w:numPr>
         <w:ind w:leftChars="0"/>
@@ -3534,6 +3537,7 @@
     <w:p>
       <w:pPr>
         <w:numPr>
+          <w:ilvl w:val="0"/>
           <w:numId w:val="0"/>
         </w:numPr>
         <w:ind w:leftChars="0"/>
@@ -3641,6 +3645,7 @@
     <w:p>
       <w:pPr>
         <w:numPr>
+          <w:ilvl w:val="0"/>
           <w:numId w:val="0"/>
         </w:numPr>
         <w:ind w:leftChars="0"/>
@@ -3669,6 +3674,7 @@
     <w:p>
       <w:pPr>
         <w:numPr>
+          <w:ilvl w:val="0"/>
           <w:numId w:val="0"/>
         </w:numPr>
         <w:ind w:leftChars="0"/>
@@ -3686,6 +3692,7 @@
     <w:p>
       <w:pPr>
         <w:numPr>
+          <w:ilvl w:val="0"/>
           <w:numId w:val="0"/>
         </w:numPr>
         <w:ind w:leftChars="0"/>
@@ -3725,6 +3732,7 @@
     <w:p>
       <w:pPr>
         <w:numPr>
+          <w:ilvl w:val="0"/>
           <w:numId w:val="0"/>
         </w:numPr>
         <w:ind w:leftChars="0"/>
@@ -3764,6 +3772,7 @@
     <w:p>
       <w:pPr>
         <w:numPr>
+          <w:ilvl w:val="0"/>
           <w:numId w:val="0"/>
         </w:numPr>
         <w:ind w:leftChars="0"/>
@@ -3803,6 +3812,7 @@
     <w:p>
       <w:pPr>
         <w:numPr>
+          <w:ilvl w:val="0"/>
           <w:numId w:val="0"/>
         </w:numPr>
         <w:ind w:leftChars="0"/>
@@ -3842,6 +3852,7 @@
     <w:p>
       <w:pPr>
         <w:numPr>
+          <w:ilvl w:val="0"/>
           <w:numId w:val="0"/>
         </w:numPr>
         <w:ind w:leftChars="0"/>
@@ -3859,6 +3870,7 @@
     <w:p>
       <w:pPr>
         <w:numPr>
+          <w:ilvl w:val="0"/>
           <w:numId w:val="0"/>
         </w:numPr>
         <w:ind w:leftChars="0"/>
@@ -3876,6 +3888,7 @@
     <w:p>
       <w:pPr>
         <w:numPr>
+          <w:ilvl w:val="0"/>
           <w:numId w:val="0"/>
         </w:numPr>
         <w:ind w:leftChars="0"/>
@@ -3893,6 +3906,7 @@
     <w:p>
       <w:pPr>
         <w:numPr>
+          <w:ilvl w:val="0"/>
           <w:numId w:val="0"/>
         </w:numPr>
         <w:ind w:leftChars="0"/>
@@ -3985,6 +3999,7 @@
     <w:p>
       <w:pPr>
         <w:numPr>
+          <w:ilvl w:val="0"/>
           <w:numId w:val="0"/>
         </w:numPr>
         <w:ind w:leftChars="0"/>
@@ -4013,6 +4028,7 @@
     <w:p>
       <w:pPr>
         <w:numPr>
+          <w:ilvl w:val="0"/>
           <w:numId w:val="0"/>
         </w:numPr>
         <w:ind w:leftChars="0"/>
@@ -4030,6 +4046,7 @@
     <w:p>
       <w:pPr>
         <w:numPr>
+          <w:ilvl w:val="0"/>
           <w:numId w:val="0"/>
         </w:numPr>
         <w:ind w:leftChars="0"/>
@@ -4080,6 +4097,7 @@
     <w:p>
       <w:pPr>
         <w:numPr>
+          <w:ilvl w:val="0"/>
           <w:numId w:val="0"/>
         </w:numPr>
         <w:ind w:leftChars="0"/>
@@ -4119,6 +4137,7 @@
     <w:p>
       <w:pPr>
         <w:numPr>
+          <w:ilvl w:val="0"/>
           <w:numId w:val="0"/>
         </w:numPr>
         <w:ind w:leftChars="0"/>
@@ -4158,6 +4177,7 @@
     <w:p>
       <w:pPr>
         <w:numPr>
+          <w:ilvl w:val="0"/>
           <w:numId w:val="0"/>
         </w:numPr>
         <w:ind w:leftChars="0"/>
@@ -4197,6 +4217,7 @@
     <w:p>
       <w:pPr>
         <w:numPr>
+          <w:ilvl w:val="0"/>
           <w:numId w:val="0"/>
         </w:numPr>
         <w:ind w:leftChars="0"/>
@@ -4225,6 +4246,7 @@
     <w:p>
       <w:pPr>
         <w:numPr>
+          <w:ilvl w:val="0"/>
           <w:numId w:val="0"/>
         </w:numPr>
         <w:ind w:leftChars="0"/>
@@ -4242,6 +4264,7 @@
     <w:p>
       <w:pPr>
         <w:numPr>
+          <w:ilvl w:val="0"/>
           <w:numId w:val="0"/>
         </w:numPr>
         <w:ind w:leftChars="0"/>
@@ -4270,6 +4293,7 @@
     <w:p>
       <w:pPr>
         <w:numPr>
+          <w:ilvl w:val="0"/>
           <w:numId w:val="0"/>
         </w:numPr>
         <w:ind w:leftChars="0"/>
@@ -4298,6 +4322,7 @@
     <w:p>
       <w:pPr>
         <w:numPr>
+          <w:ilvl w:val="0"/>
           <w:numId w:val="0"/>
         </w:numPr>
         <w:ind w:leftChars="0"/>
@@ -4315,6 +4340,7 @@
     <w:p>
       <w:pPr>
         <w:numPr>
+          <w:ilvl w:val="0"/>
           <w:numId w:val="0"/>
         </w:numPr>
         <w:ind w:leftChars="0"/>
@@ -4332,6 +4358,7 @@
     <w:p>
       <w:pPr>
         <w:numPr>
+          <w:ilvl w:val="0"/>
           <w:numId w:val="0"/>
         </w:numPr>
         <w:ind w:leftChars="0"/>
@@ -4349,6 +4376,7 @@
     <w:p>
       <w:pPr>
         <w:numPr>
+          <w:ilvl w:val="0"/>
           <w:numId w:val="0"/>
         </w:numPr>
         <w:ind w:leftChars="0"/>
@@ -4366,6 +4394,7 @@
     <w:p>
       <w:pPr>
         <w:numPr>
+          <w:ilvl w:val="0"/>
           <w:numId w:val="0"/>
         </w:numPr>
         <w:ind w:leftChars="0"/>
@@ -4383,6 +4412,7 @@
     <w:p>
       <w:pPr>
         <w:numPr>
+          <w:ilvl w:val="0"/>
           <w:numId w:val="0"/>
         </w:numPr>
         <w:ind w:leftChars="0"/>
@@ -4400,6 +4430,7 @@
     <w:p>
       <w:pPr>
         <w:numPr>
+          <w:ilvl w:val="0"/>
           <w:numId w:val="0"/>
         </w:numPr>
         <w:ind w:leftChars="0"/>
@@ -4446,6 +4477,7 @@
     <w:p>
       <w:pPr>
         <w:numPr>
+          <w:ilvl w:val="0"/>
           <w:numId w:val="0"/>
         </w:numPr>
         <w:ind w:leftChars="0"/>
@@ -4535,6 +4567,7 @@
     <w:p>
       <w:pPr>
         <w:numPr>
+          <w:ilvl w:val="0"/>
           <w:numId w:val="0"/>
         </w:numPr>
         <w:ind w:leftChars="0"/>
@@ -4563,6 +4596,7 @@
     <w:p>
       <w:pPr>
         <w:numPr>
+          <w:ilvl w:val="0"/>
           <w:numId w:val="0"/>
         </w:numPr>
         <w:ind w:leftChars="0"/>
@@ -4580,6 +4614,7 @@
     <w:p>
       <w:pPr>
         <w:numPr>
+          <w:ilvl w:val="0"/>
           <w:numId w:val="0"/>
         </w:numPr>
         <w:ind w:leftChars="0"/>
@@ -4608,6 +4643,7 @@
     <w:p>
       <w:pPr>
         <w:numPr>
+          <w:ilvl w:val="0"/>
           <w:numId w:val="0"/>
         </w:numPr>
         <w:ind w:leftChars="0"/>
@@ -4636,6 +4672,7 @@
     <w:p>
       <w:pPr>
         <w:numPr>
+          <w:ilvl w:val="0"/>
           <w:numId w:val="0"/>
         </w:numPr>
         <w:ind w:leftChars="0"/>
@@ -4664,6 +4701,7 @@
     <w:p>
       <w:pPr>
         <w:numPr>
+          <w:ilvl w:val="0"/>
           <w:numId w:val="0"/>
         </w:numPr>
         <w:ind w:leftChars="0"/>
@@ -4692,6 +4730,7 @@
     <w:p>
       <w:pPr>
         <w:numPr>
+          <w:ilvl w:val="0"/>
           <w:numId w:val="0"/>
         </w:numPr>
         <w:ind w:leftChars="0"/>
@@ -4720,6 +4759,7 @@
     <w:p>
       <w:pPr>
         <w:numPr>
+          <w:ilvl w:val="0"/>
           <w:numId w:val="0"/>
         </w:numPr>
         <w:ind w:leftChars="0"/>
@@ -4737,6 +4777,7 @@
     <w:p>
       <w:pPr>
         <w:numPr>
+          <w:ilvl w:val="0"/>
           <w:numId w:val="0"/>
         </w:numPr>
         <w:ind w:leftChars="0"/>
@@ -4765,6 +4806,7 @@
     <w:p>
       <w:pPr>
         <w:numPr>
+          <w:ilvl w:val="0"/>
           <w:numId w:val="0"/>
         </w:numPr>
         <w:ind w:leftChars="0"/>
@@ -4793,6 +4835,7 @@
     <w:p>
       <w:pPr>
         <w:numPr>
+          <w:ilvl w:val="0"/>
           <w:numId w:val="0"/>
         </w:numPr>
         <w:ind w:leftChars="0"/>
@@ -4821,6 +4864,7 @@
     <w:p>
       <w:pPr>
         <w:numPr>
+          <w:ilvl w:val="0"/>
           <w:numId w:val="0"/>
         </w:numPr>
         <w:ind w:leftChars="0"/>
@@ -4838,6 +4882,7 @@
     <w:p>
       <w:pPr>
         <w:numPr>
+          <w:ilvl w:val="0"/>
           <w:numId w:val="0"/>
         </w:numPr>
         <w:ind w:leftChars="0"/>
@@ -4877,6 +4922,7 @@
     <w:p>
       <w:pPr>
         <w:numPr>
+          <w:ilvl w:val="0"/>
           <w:numId w:val="0"/>
         </w:numPr>
         <w:ind w:leftChars="0"/>
@@ -4905,6 +4951,7 @@
     <w:p>
       <w:pPr>
         <w:numPr>
+          <w:ilvl w:val="0"/>
           <w:numId w:val="0"/>
         </w:numPr>
         <w:ind w:leftChars="0"/>
@@ -4922,6 +4969,7 @@
     <w:p>
       <w:pPr>
         <w:numPr>
+          <w:ilvl w:val="0"/>
           <w:numId w:val="0"/>
         </w:numPr>
         <w:ind w:leftChars="0"/>
@@ -4961,6 +5009,7 @@
     <w:p>
       <w:pPr>
         <w:numPr>
+          <w:ilvl w:val="0"/>
           <w:numId w:val="0"/>
         </w:numPr>
         <w:ind w:leftChars="0"/>
@@ -4989,6 +5038,7 @@
     <w:p>
       <w:pPr>
         <w:numPr>
+          <w:ilvl w:val="0"/>
           <w:numId w:val="0"/>
         </w:numPr>
         <w:ind w:leftChars="0"/>
@@ -5012,13 +5062,42 @@
         <w:jc w:val="left"/>
         <w:rPr>
           <w:rFonts w:hint="default" w:ascii="Calibri" w:hAnsi="Calibri"/>
-          <w:b w:val="0"/>
-          <w:bCs w:val="0"/>
-          <w:sz w:val="28"/>
-          <w:szCs w:val="28"/>
-          <w:lang w:val="en-US"/>
-        </w:rPr>
-      </w:pPr>
+          <w:b/>
+          <w:bCs/>
+          <w:sz w:val="32"/>
+          <w:szCs w:val="32"/>
+          <w:lang w:val="en-US"/>
+        </w:rPr>
+      </w:pPr>
+    </w:p>
+    <w:p>
+      <w:pPr>
+        <w:numPr>
+          <w:ilvl w:val="0"/>
+          <w:numId w:val="1"/>
+        </w:numPr>
+        <w:ind w:left="0" w:leftChars="0" w:firstLine="0" w:firstLineChars="0"/>
+        <w:jc w:val="left"/>
+        <w:rPr>
+          <w:rFonts w:hint="default" w:ascii="Calibri" w:hAnsi="Calibri"/>
+          <w:b/>
+          <w:bCs/>
+          <w:sz w:val="32"/>
+          <w:szCs w:val="32"/>
+          <w:lang w:val="en-US"/>
+        </w:rPr>
+      </w:pPr>
+      <w:r>
+        <w:rPr>
+          <w:rFonts w:hint="default" w:ascii="Calibri" w:hAnsi="Calibri"/>
+          <w:b/>
+          <w:bCs/>
+          <w:sz w:val="32"/>
+          <w:szCs w:val="32"/>
+          <w:lang w:val="en-US"/>
+        </w:rPr>
+        <w:t xml:space="preserve">Third Party Services </w:t>
+      </w:r>
     </w:p>
     <w:p>
       <w:pPr>
@@ -5029,272 +5108,1678 @@
         <w:jc w:val="left"/>
         <w:rPr>
           <w:rFonts w:hint="default" w:ascii="Calibri" w:hAnsi="Calibri"/>
-          <w:b w:val="0"/>
-          <w:bCs w:val="0"/>
-          <w:sz w:val="28"/>
-          <w:szCs w:val="28"/>
-          <w:lang w:val="en-US"/>
-        </w:rPr>
-      </w:pPr>
-    </w:p>
-    <w:p>
-      <w:pPr>
-        <w:numPr>
-          <w:numId w:val="0"/>
-        </w:numPr>
-        <w:ind w:leftChars="0"/>
-        <w:jc w:val="left"/>
-        <w:rPr>
-          <w:rFonts w:hint="default" w:ascii="Calibri" w:hAnsi="Calibri"/>
-          <w:b w:val="0"/>
-          <w:bCs w:val="0"/>
-          <w:sz w:val="28"/>
-          <w:szCs w:val="28"/>
-          <w:lang w:val="en-US"/>
-        </w:rPr>
-      </w:pPr>
-    </w:p>
-    <w:p>
-      <w:pPr>
-        <w:numPr>
-          <w:numId w:val="0"/>
-        </w:numPr>
-        <w:ind w:leftChars="0"/>
-        <w:jc w:val="left"/>
-        <w:rPr>
-          <w:rFonts w:hint="default" w:ascii="Calibri" w:hAnsi="Calibri"/>
-          <w:b w:val="0"/>
-          <w:bCs w:val="0"/>
-          <w:sz w:val="28"/>
-          <w:szCs w:val="28"/>
-          <w:lang w:val="en-US"/>
-        </w:rPr>
-      </w:pPr>
-    </w:p>
-    <w:p>
-      <w:pPr>
-        <w:numPr>
-          <w:numId w:val="0"/>
-        </w:numPr>
-        <w:ind w:leftChars="0"/>
-        <w:jc w:val="left"/>
-        <w:rPr>
-          <w:rFonts w:hint="default" w:ascii="Calibri" w:hAnsi="Calibri"/>
-          <w:b w:val="0"/>
-          <w:bCs w:val="0"/>
-          <w:sz w:val="28"/>
-          <w:szCs w:val="28"/>
-          <w:lang w:val="en-US"/>
-        </w:rPr>
-      </w:pPr>
-    </w:p>
-    <w:p>
-      <w:pPr>
-        <w:numPr>
-          <w:numId w:val="0"/>
-        </w:numPr>
-        <w:ind w:leftChars="0"/>
-        <w:jc w:val="left"/>
-        <w:rPr>
-          <w:rFonts w:hint="default" w:ascii="Calibri" w:hAnsi="Calibri"/>
-          <w:b w:val="0"/>
-          <w:bCs w:val="0"/>
-          <w:sz w:val="28"/>
-          <w:szCs w:val="28"/>
-          <w:lang w:val="en-US"/>
-        </w:rPr>
-      </w:pPr>
-    </w:p>
-    <w:p>
-      <w:pPr>
-        <w:numPr>
-          <w:numId w:val="0"/>
-        </w:numPr>
-        <w:ind w:leftChars="0"/>
-        <w:jc w:val="left"/>
-        <w:rPr>
-          <w:rFonts w:hint="default" w:ascii="Calibri" w:hAnsi="Calibri"/>
-          <w:b w:val="0"/>
-          <w:bCs w:val="0"/>
-          <w:sz w:val="28"/>
-          <w:szCs w:val="28"/>
-          <w:lang w:val="en-US"/>
-        </w:rPr>
-      </w:pPr>
-    </w:p>
-    <w:p>
-      <w:pPr>
-        <w:numPr>
-          <w:numId w:val="0"/>
-        </w:numPr>
-        <w:ind w:leftChars="0"/>
-        <w:jc w:val="left"/>
-        <w:rPr>
-          <w:rFonts w:hint="default" w:ascii="Calibri" w:hAnsi="Calibri"/>
-          <w:b w:val="0"/>
-          <w:bCs w:val="0"/>
-          <w:sz w:val="28"/>
-          <w:szCs w:val="28"/>
-          <w:lang w:val="en-US"/>
-        </w:rPr>
-      </w:pPr>
-    </w:p>
-    <w:p>
-      <w:pPr>
-        <w:numPr>
-          <w:numId w:val="0"/>
-        </w:numPr>
-        <w:ind w:leftChars="0"/>
-        <w:jc w:val="left"/>
-        <w:rPr>
-          <w:rFonts w:hint="default" w:ascii="Calibri" w:hAnsi="Calibri"/>
-          <w:b w:val="0"/>
-          <w:bCs w:val="0"/>
-          <w:sz w:val="28"/>
-          <w:szCs w:val="28"/>
-          <w:lang w:val="en-US"/>
-        </w:rPr>
-      </w:pPr>
-    </w:p>
-    <w:p>
-      <w:pPr>
-        <w:numPr>
-          <w:numId w:val="0"/>
-        </w:numPr>
-        <w:ind w:leftChars="0"/>
-        <w:jc w:val="left"/>
-        <w:rPr>
-          <w:rFonts w:hint="default" w:ascii="Calibri" w:hAnsi="Calibri"/>
-          <w:b w:val="0"/>
-          <w:bCs w:val="0"/>
-          <w:sz w:val="28"/>
-          <w:szCs w:val="28"/>
-          <w:lang w:val="en-US"/>
-        </w:rPr>
-      </w:pPr>
-    </w:p>
-    <w:p>
-      <w:pPr>
-        <w:numPr>
-          <w:numId w:val="0"/>
-        </w:numPr>
-        <w:ind w:leftChars="0"/>
-        <w:jc w:val="left"/>
-        <w:rPr>
-          <w:rFonts w:hint="default" w:ascii="Calibri" w:hAnsi="Calibri"/>
-          <w:b w:val="0"/>
-          <w:bCs w:val="0"/>
-          <w:sz w:val="28"/>
-          <w:szCs w:val="28"/>
-          <w:lang w:val="en-US"/>
-        </w:rPr>
-      </w:pPr>
-    </w:p>
-    <w:p>
-      <w:pPr>
-        <w:numPr>
-          <w:numId w:val="0"/>
-        </w:numPr>
-        <w:ind w:leftChars="0"/>
-        <w:jc w:val="left"/>
-        <w:rPr>
-          <w:rFonts w:hint="default" w:ascii="Calibri" w:hAnsi="Calibri"/>
-          <w:b w:val="0"/>
-          <w:bCs w:val="0"/>
-          <w:sz w:val="28"/>
-          <w:szCs w:val="28"/>
-          <w:lang w:val="en-US"/>
-        </w:rPr>
-      </w:pPr>
-    </w:p>
-    <w:p>
-      <w:pPr>
-        <w:numPr>
-          <w:numId w:val="0"/>
-        </w:numPr>
-        <w:ind w:leftChars="0"/>
-        <w:jc w:val="left"/>
-        <w:rPr>
-          <w:rFonts w:hint="default" w:ascii="Calibri" w:hAnsi="Calibri"/>
-          <w:b w:val="0"/>
-          <w:bCs w:val="0"/>
-          <w:sz w:val="28"/>
-          <w:szCs w:val="28"/>
-          <w:lang w:val="en-US"/>
-        </w:rPr>
-      </w:pPr>
-    </w:p>
-    <w:p>
-      <w:pPr>
-        <w:numPr>
-          <w:numId w:val="0"/>
-        </w:numPr>
-        <w:ind w:leftChars="0"/>
-        <w:jc w:val="left"/>
-        <w:rPr>
-          <w:rFonts w:hint="default" w:ascii="Calibri" w:hAnsi="Calibri"/>
-          <w:b w:val="0"/>
-          <w:bCs w:val="0"/>
-          <w:sz w:val="28"/>
-          <w:szCs w:val="28"/>
-          <w:lang w:val="en-US"/>
-        </w:rPr>
-      </w:pPr>
-    </w:p>
-    <w:p>
-      <w:pPr>
-        <w:numPr>
-          <w:numId w:val="0"/>
-        </w:numPr>
-        <w:ind w:leftChars="0"/>
-        <w:jc w:val="left"/>
-        <w:rPr>
-          <w:rFonts w:hint="default" w:ascii="Calibri" w:hAnsi="Calibri"/>
-          <w:b w:val="0"/>
-          <w:bCs w:val="0"/>
-          <w:sz w:val="28"/>
-          <w:szCs w:val="28"/>
-          <w:lang w:val="en-US"/>
-        </w:rPr>
-      </w:pPr>
-    </w:p>
-    <w:p>
-      <w:pPr>
-        <w:numPr>
-          <w:numId w:val="0"/>
-        </w:numPr>
-        <w:ind w:leftChars="0"/>
-        <w:jc w:val="left"/>
-        <w:rPr>
-          <w:rFonts w:hint="default" w:ascii="Calibri" w:hAnsi="Calibri"/>
-          <w:b w:val="0"/>
-          <w:bCs w:val="0"/>
-          <w:sz w:val="28"/>
-          <w:szCs w:val="28"/>
-          <w:lang w:val="en-US"/>
-        </w:rPr>
-      </w:pPr>
-    </w:p>
-    <w:p>
-      <w:pPr>
-        <w:numPr>
-          <w:numId w:val="0"/>
-        </w:numPr>
-        <w:ind w:leftChars="0"/>
-        <w:jc w:val="left"/>
-        <w:rPr>
-          <w:rFonts w:hint="default" w:ascii="Calibri" w:hAnsi="Calibri"/>
-          <w:b w:val="0"/>
-          <w:bCs w:val="0"/>
-          <w:sz w:val="28"/>
-          <w:szCs w:val="28"/>
-          <w:lang w:val="en-US"/>
-        </w:rPr>
-      </w:pPr>
-    </w:p>
-    <w:p>
-      <w:pPr>
-        <w:numPr>
+          <w:b/>
+          <w:bCs/>
+          <w:sz w:val="28"/>
+          <w:szCs w:val="28"/>
+          <w:lang w:val="en-US"/>
+        </w:rPr>
+      </w:pPr>
+    </w:p>
+    <w:p>
+      <w:pPr>
+        <w:spacing w:before="0" w:after="200" w:line="276" w:lineRule="auto"/>
+        <w:ind w:left="0" w:right="0" w:firstLine="0"/>
+        <w:jc w:val="left"/>
+        <w:rPr>
+          <w:rFonts w:ascii="Calibri" w:hAnsi="Calibri" w:eastAsia="Calibri" w:cs="Calibri"/>
+          <w:color w:val="auto"/>
+          <w:spacing w:val="0"/>
+          <w:position w:val="0"/>
+          <w:sz w:val="28"/>
+          <w:szCs w:val="22"/>
+          <w:shd w:val="clear" w:fill="auto"/>
+        </w:rPr>
+      </w:pPr>
+      <w:r>
+        <w:rPr>
+          <w:rFonts w:ascii="SimSun" w:hAnsi="SimSun" w:eastAsia="SimSun" w:cs="SimSun"/>
+          <w:sz w:val="24"/>
+          <w:szCs w:val="24"/>
+        </w:rPr>
+        <w:drawing>
+          <wp:anchor distT="0" distB="0" distL="114300" distR="114300" simplePos="0" relativeHeight="251671552" behindDoc="0" locked="0" layoutInCell="1" allowOverlap="1">
+            <wp:simplePos x="0" y="0"/>
+            <wp:positionH relativeFrom="column">
+              <wp:posOffset>4182110</wp:posOffset>
+            </wp:positionH>
+            <wp:positionV relativeFrom="paragraph">
+              <wp:posOffset>24130</wp:posOffset>
+            </wp:positionV>
+            <wp:extent cx="2730500" cy="640080"/>
+            <wp:effectExtent l="0" t="0" r="12700" b="7620"/>
+            <wp:wrapSquare wrapText="bothSides"/>
+            <wp:docPr id="10" name="Picture 1" descr="IMG_256"/>
+            <wp:cNvGraphicFramePr>
+              <a:graphicFrameLocks xmlns:a="http://schemas.openxmlformats.org/drawingml/2006/main" noChangeAspect="1"/>
+            </wp:cNvGraphicFramePr>
+            <a:graphic xmlns:a="http://schemas.openxmlformats.org/drawingml/2006/main">
+              <a:graphicData uri="http://schemas.openxmlformats.org/drawingml/2006/picture">
+                <pic:pic xmlns:pic="http://schemas.openxmlformats.org/drawingml/2006/picture">
+                  <pic:nvPicPr>
+                    <pic:cNvPr id="10" name="Picture 1" descr="IMG_256"/>
+                    <pic:cNvPicPr>
+                      <a:picLocks noChangeAspect="1"/>
+                    </pic:cNvPicPr>
+                  </pic:nvPicPr>
+                  <pic:blipFill>
+                    <a:blip r:embed="rId15"/>
+                    <a:srcRect t="27891" b="27466"/>
+                    <a:stretch>
+                      <a:fillRect/>
+                    </a:stretch>
+                  </pic:blipFill>
+                  <pic:spPr>
+                    <a:xfrm>
+                      <a:off x="0" y="0"/>
+                      <a:ext cx="2730500" cy="640080"/>
+                    </a:xfrm>
+                    <a:prstGeom prst="rect">
+                      <a:avLst/>
+                    </a:prstGeom>
+                    <a:noFill/>
+                    <a:ln w="9525">
+                      <a:noFill/>
+                    </a:ln>
+                  </pic:spPr>
+                </pic:pic>
+              </a:graphicData>
+            </a:graphic>
+          </wp:anchor>
+        </w:drawing>
+      </w:r>
+      <w:r>
+        <w:rPr>
+          <w:rFonts w:hint="default" w:ascii="Calibri" w:hAnsi="Calibri"/>
+          <w:b/>
+          <w:bCs/>
+          <w:sz w:val="28"/>
+          <w:szCs w:val="28"/>
+          <w:lang w:val="en-US"/>
+        </w:rPr>
+        <w:t>SendGrid:</w:t>
+      </w:r>
+      <w:r>
+        <w:rPr>
+          <w:rFonts w:ascii="Calibri" w:hAnsi="Calibri" w:eastAsia="Calibri" w:cs="Calibri"/>
+          <w:color w:val="auto"/>
+          <w:spacing w:val="0"/>
+          <w:position w:val="0"/>
+          <w:sz w:val="28"/>
+          <w:szCs w:val="22"/>
+          <w:shd w:val="clear" w:fill="auto"/>
+        </w:rPr>
+        <w:t>Email Delivery Service</w:t>
+      </w:r>
+      <w:r>
+        <w:rPr>
+          <w:rFonts w:ascii="Calibri" w:hAnsi="Calibri" w:eastAsia="Calibri" w:cs="Calibri"/>
+          <w:color w:val="auto"/>
+          <w:spacing w:val="0"/>
+          <w:position w:val="0"/>
+          <w:sz w:val="28"/>
+          <w:szCs w:val="22"/>
+          <w:shd w:val="clear" w:fill="auto"/>
+        </w:rPr>
+        <w:br w:type="textWrapping"/>
+      </w:r>
+      <w:r>
+        <w:rPr>
+          <w:rFonts w:ascii="Calibri" w:hAnsi="Calibri" w:eastAsia="Calibri" w:cs="Calibri"/>
+          <w:color w:val="auto"/>
+          <w:spacing w:val="0"/>
+          <w:position w:val="0"/>
+          <w:sz w:val="28"/>
+          <w:szCs w:val="22"/>
+          <w:shd w:val="clear" w:fill="auto"/>
+        </w:rPr>
+        <w:t>SendGrid is a cloud-based email delivery platform that provides businesses with the tools to send transactional and marketing emails at scale. It offers a range of APIs and SMTP services for email delivery, along with analytics to track email performance, ensuring high deliverability rates and reliable service. SendGrid is popular among developers for its ease of integration with both small applications and large-scale enterprise systems.</w:t>
+      </w:r>
+    </w:p>
+    <w:p>
+      <w:pPr>
+        <w:spacing w:before="0" w:after="200" w:line="276" w:lineRule="auto"/>
+        <w:ind w:left="0" w:right="0" w:firstLine="0"/>
+        <w:jc w:val="left"/>
+        <w:rPr>
+          <w:rFonts w:hint="default" w:ascii="Calibri" w:hAnsi="Calibri" w:eastAsia="Calibri"/>
+          <w:color w:val="auto"/>
+          <w:spacing w:val="0"/>
+          <w:position w:val="0"/>
+          <w:sz w:val="28"/>
+          <w:szCs w:val="22"/>
+          <w:shd w:val="clear" w:fill="auto"/>
+        </w:rPr>
+      </w:pPr>
+      <w:r>
+        <w:rPr>
+          <w:rFonts w:hint="default" w:ascii="Calibri" w:hAnsi="Calibri" w:eastAsia="Calibri"/>
+          <w:b/>
+          <w:bCs/>
+          <w:color w:val="auto"/>
+          <w:spacing w:val="0"/>
+          <w:position w:val="0"/>
+          <w:sz w:val="28"/>
+          <w:szCs w:val="22"/>
+          <w:shd w:val="clear" w:fill="auto"/>
+        </w:rPr>
+        <w:t>Email API:</w:t>
+      </w:r>
+      <w:r>
+        <w:rPr>
+          <w:rFonts w:hint="default" w:ascii="Calibri" w:hAnsi="Calibri" w:eastAsia="Calibri"/>
+          <w:color w:val="auto"/>
+          <w:spacing w:val="0"/>
+          <w:position w:val="0"/>
+          <w:sz w:val="28"/>
+          <w:szCs w:val="22"/>
+          <w:shd w:val="clear" w:fill="auto"/>
+        </w:rPr>
+        <w:t xml:space="preserve"> Allows developers to send email messages from their applications, with options for both transactional and marketing emails.</w:t>
+      </w:r>
+      <w:r>
+        <w:rPr>
+          <w:rFonts w:hint="default" w:ascii="Calibri" w:hAnsi="Calibri" w:eastAsia="Calibri"/>
+          <w:color w:val="auto"/>
+          <w:spacing w:val="0"/>
+          <w:position w:val="0"/>
+          <w:sz w:val="28"/>
+          <w:szCs w:val="22"/>
+          <w:shd w:val="clear" w:fill="auto"/>
+        </w:rPr>
+        <w:br w:type="textWrapping"/>
+      </w:r>
+      <w:r>
+        <w:rPr>
+          <w:rFonts w:hint="default" w:ascii="Calibri" w:hAnsi="Calibri" w:eastAsia="Calibri"/>
+          <w:b/>
+          <w:bCs/>
+          <w:color w:val="auto"/>
+          <w:spacing w:val="0"/>
+          <w:position w:val="0"/>
+          <w:sz w:val="28"/>
+          <w:szCs w:val="22"/>
+          <w:shd w:val="clear" w:fill="auto"/>
+        </w:rPr>
+        <w:t>SMTP Relay:</w:t>
+      </w:r>
+      <w:r>
+        <w:rPr>
+          <w:rFonts w:hint="default" w:ascii="Calibri" w:hAnsi="Calibri" w:eastAsia="Calibri"/>
+          <w:color w:val="auto"/>
+          <w:spacing w:val="0"/>
+          <w:position w:val="0"/>
+          <w:sz w:val="28"/>
+          <w:szCs w:val="22"/>
+          <w:shd w:val="clear" w:fill="auto"/>
+        </w:rPr>
+        <w:t xml:space="preserve"> Provides a reliable service for sending emails using the SMTP protocol, making it easy to integrate into existing systems.</w:t>
+      </w:r>
+      <w:r>
+        <w:rPr>
+          <w:rFonts w:hint="default" w:ascii="Calibri" w:hAnsi="Calibri" w:eastAsia="Calibri"/>
+          <w:color w:val="auto"/>
+          <w:spacing w:val="0"/>
+          <w:position w:val="0"/>
+          <w:sz w:val="28"/>
+          <w:szCs w:val="22"/>
+          <w:shd w:val="clear" w:fill="auto"/>
+        </w:rPr>
+        <w:br w:type="textWrapping"/>
+      </w:r>
+      <w:r>
+        <w:rPr>
+          <w:rFonts w:hint="default" w:ascii="Calibri" w:hAnsi="Calibri" w:eastAsia="Calibri"/>
+          <w:b/>
+          <w:bCs/>
+          <w:color w:val="auto"/>
+          <w:spacing w:val="0"/>
+          <w:position w:val="0"/>
+          <w:sz w:val="28"/>
+          <w:szCs w:val="22"/>
+          <w:shd w:val="clear" w:fill="auto"/>
+        </w:rPr>
+        <w:t>Deliverability Tools:</w:t>
+      </w:r>
+      <w:r>
+        <w:rPr>
+          <w:rFonts w:hint="default" w:ascii="Calibri" w:hAnsi="Calibri" w:eastAsia="Calibri"/>
+          <w:color w:val="auto"/>
+          <w:spacing w:val="0"/>
+          <w:position w:val="0"/>
+          <w:sz w:val="28"/>
+          <w:szCs w:val="22"/>
+          <w:shd w:val="clear" w:fill="auto"/>
+        </w:rPr>
+        <w:t xml:space="preserve"> Includes tools to track email delivery, open rates, click rates, and more, to optimize performance.</w:t>
+      </w:r>
+      <w:r>
+        <w:rPr>
+          <w:rFonts w:hint="default" w:ascii="Calibri" w:hAnsi="Calibri" w:eastAsia="Calibri"/>
+          <w:color w:val="auto"/>
+          <w:spacing w:val="0"/>
+          <w:position w:val="0"/>
+          <w:sz w:val="28"/>
+          <w:szCs w:val="22"/>
+          <w:shd w:val="clear" w:fill="auto"/>
+        </w:rPr>
+        <w:br w:type="textWrapping"/>
+      </w:r>
+      <w:r>
+        <w:rPr>
+          <w:rFonts w:hint="default" w:ascii="Calibri" w:hAnsi="Calibri" w:eastAsia="Calibri"/>
+          <w:b/>
+          <w:bCs/>
+          <w:color w:val="auto"/>
+          <w:spacing w:val="0"/>
+          <w:position w:val="0"/>
+          <w:sz w:val="28"/>
+          <w:szCs w:val="22"/>
+          <w:shd w:val="clear" w:fill="auto"/>
+        </w:rPr>
+        <w:t>Templates and Personalization:</w:t>
+      </w:r>
+      <w:r>
+        <w:rPr>
+          <w:rFonts w:hint="default" w:ascii="Calibri" w:hAnsi="Calibri" w:eastAsia="Calibri"/>
+          <w:color w:val="auto"/>
+          <w:spacing w:val="0"/>
+          <w:position w:val="0"/>
+          <w:sz w:val="28"/>
+          <w:szCs w:val="22"/>
+          <w:shd w:val="clear" w:fill="auto"/>
+        </w:rPr>
+        <w:t xml:space="preserve"> Users can create and send customized email templates for better engagement with recipients.</w:t>
+      </w:r>
+      <w:r>
+        <w:rPr>
+          <w:rFonts w:hint="default" w:ascii="Calibri" w:hAnsi="Calibri" w:eastAsia="Calibri"/>
+          <w:color w:val="auto"/>
+          <w:spacing w:val="0"/>
+          <w:position w:val="0"/>
+          <w:sz w:val="28"/>
+          <w:szCs w:val="22"/>
+          <w:shd w:val="clear" w:fill="auto"/>
+        </w:rPr>
+        <w:br w:type="textWrapping"/>
+      </w:r>
+      <w:r>
+        <w:rPr>
+          <w:rFonts w:hint="default" w:ascii="Calibri" w:hAnsi="Calibri" w:eastAsia="Calibri"/>
+          <w:b/>
+          <w:bCs/>
+          <w:color w:val="auto"/>
+          <w:spacing w:val="0"/>
+          <w:position w:val="0"/>
+          <w:sz w:val="28"/>
+          <w:szCs w:val="22"/>
+          <w:shd w:val="clear" w:fill="auto"/>
+        </w:rPr>
+        <w:t>Scalability:</w:t>
+      </w:r>
+      <w:r>
+        <w:rPr>
+          <w:rFonts w:hint="default" w:ascii="Calibri" w:hAnsi="Calibri" w:eastAsia="Calibri"/>
+          <w:color w:val="auto"/>
+          <w:spacing w:val="0"/>
+          <w:position w:val="0"/>
+          <w:sz w:val="28"/>
+          <w:szCs w:val="22"/>
+          <w:shd w:val="clear" w:fill="auto"/>
+        </w:rPr>
+        <w:t xml:space="preserve"> Supports both small and large-scale email sending needs, suitable for businesses of any size.</w:t>
+      </w:r>
+      <w:r>
+        <w:rPr>
+          <w:rFonts w:hint="default" w:ascii="Calibri" w:hAnsi="Calibri" w:eastAsia="Calibri"/>
+          <w:color w:val="auto"/>
+          <w:spacing w:val="0"/>
+          <w:position w:val="0"/>
+          <w:sz w:val="28"/>
+          <w:szCs w:val="22"/>
+          <w:shd w:val="clear" w:fill="auto"/>
+        </w:rPr>
+        <w:br w:type="textWrapping"/>
+      </w:r>
+      <w:r>
+        <w:rPr>
+          <w:rFonts w:hint="default" w:ascii="Calibri" w:hAnsi="Calibri" w:eastAsia="Calibri"/>
+          <w:b/>
+          <w:bCs/>
+          <w:color w:val="auto"/>
+          <w:spacing w:val="0"/>
+          <w:position w:val="0"/>
+          <w:sz w:val="28"/>
+          <w:szCs w:val="22"/>
+          <w:shd w:val="clear" w:fill="auto"/>
+        </w:rPr>
+        <w:t xml:space="preserve">Security: </w:t>
+      </w:r>
+      <w:r>
+        <w:rPr>
+          <w:rFonts w:hint="default" w:ascii="Calibri" w:hAnsi="Calibri" w:eastAsia="Calibri"/>
+          <w:color w:val="auto"/>
+          <w:spacing w:val="0"/>
+          <w:position w:val="0"/>
+          <w:sz w:val="28"/>
+          <w:szCs w:val="22"/>
+          <w:shd w:val="clear" w:fill="auto"/>
+        </w:rPr>
+        <w:t>Offers features like email authentication and encryption to protect against phishing and unauthorized access.</w:t>
+      </w:r>
+    </w:p>
+    <w:p>
+      <w:pPr>
+        <w:spacing w:before="0" w:after="200" w:line="276" w:lineRule="auto"/>
+        <w:ind w:left="0" w:right="0" w:firstLine="0"/>
+        <w:jc w:val="left"/>
+        <w:rPr>
+          <w:rFonts w:hint="default" w:ascii="Calibri" w:hAnsi="Calibri" w:eastAsia="Calibri"/>
+          <w:b/>
+          <w:bCs/>
+          <w:color w:val="auto"/>
+          <w:spacing w:val="0"/>
+          <w:position w:val="0"/>
+          <w:sz w:val="28"/>
+          <w:szCs w:val="22"/>
+          <w:shd w:val="clear" w:fill="auto"/>
+        </w:rPr>
+      </w:pPr>
+      <w:r>
+        <w:rPr>
+          <w:rFonts w:hint="default" w:ascii="Calibri" w:hAnsi="Calibri" w:eastAsia="Calibri"/>
+          <w:b/>
+          <w:bCs/>
+          <w:color w:val="auto"/>
+          <w:spacing w:val="0"/>
+          <w:position w:val="0"/>
+          <w:sz w:val="28"/>
+          <w:szCs w:val="22"/>
+          <w:shd w:val="clear" w:fill="auto"/>
+        </w:rPr>
+        <w:t>Use Cases:</w:t>
+      </w:r>
+    </w:p>
+    <w:p>
+      <w:pPr>
+        <w:spacing w:before="0" w:after="200" w:line="276" w:lineRule="auto"/>
+        <w:ind w:left="0" w:right="0" w:firstLine="0"/>
+        <w:jc w:val="left"/>
+        <w:rPr>
+          <w:rFonts w:hint="default" w:ascii="Calibri" w:hAnsi="Calibri" w:eastAsia="Calibri"/>
+          <w:color w:val="auto"/>
+          <w:spacing w:val="0"/>
+          <w:position w:val="0"/>
+          <w:sz w:val="28"/>
+          <w:szCs w:val="22"/>
+          <w:shd w:val="clear" w:fill="auto"/>
+        </w:rPr>
+      </w:pPr>
+      <w:r>
+        <w:rPr>
+          <w:rFonts w:hint="default" w:ascii="Calibri" w:hAnsi="Calibri" w:eastAsia="Calibri"/>
+          <w:color w:val="auto"/>
+          <w:spacing w:val="0"/>
+          <w:position w:val="0"/>
+          <w:sz w:val="28"/>
+          <w:szCs w:val="22"/>
+          <w:shd w:val="clear" w:fill="auto"/>
+        </w:rPr>
+        <w:t>Sending transactional emails (e.g., order confirmations, password resets).</w:t>
+      </w:r>
+    </w:p>
+    <w:p>
+      <w:pPr>
+        <w:spacing w:before="0" w:after="200" w:line="276" w:lineRule="auto"/>
+        <w:ind w:left="0" w:right="0" w:firstLine="0"/>
+        <w:jc w:val="left"/>
+        <w:rPr>
+          <w:rFonts w:hint="default" w:ascii="Calibri" w:hAnsi="Calibri" w:eastAsia="Calibri"/>
+          <w:color w:val="auto"/>
+          <w:spacing w:val="0"/>
+          <w:position w:val="0"/>
+          <w:sz w:val="28"/>
+          <w:szCs w:val="22"/>
+          <w:shd w:val="clear" w:fill="auto"/>
+        </w:rPr>
+      </w:pPr>
+      <w:r>
+        <w:rPr>
+          <w:rFonts w:hint="default" w:ascii="Calibri" w:hAnsi="Calibri" w:eastAsia="Calibri"/>
+          <w:color w:val="auto"/>
+          <w:spacing w:val="0"/>
+          <w:position w:val="0"/>
+          <w:sz w:val="28"/>
+          <w:szCs w:val="22"/>
+          <w:shd w:val="clear" w:fill="auto"/>
+        </w:rPr>
+        <w:t>Running marketing campaigns with advanced email personalization.</w:t>
+      </w:r>
+    </w:p>
+    <w:p>
+      <w:pPr>
+        <w:spacing w:before="0" w:after="200" w:line="276" w:lineRule="auto"/>
+        <w:ind w:left="0" w:right="0" w:firstLine="0"/>
+        <w:jc w:val="left"/>
+        <w:rPr>
+          <w:rFonts w:ascii="Calibri" w:hAnsi="Calibri" w:eastAsia="Calibri" w:cs="Calibri"/>
+          <w:color w:val="auto"/>
+          <w:spacing w:val="0"/>
+          <w:position w:val="0"/>
+          <w:sz w:val="28"/>
+          <w:szCs w:val="22"/>
+          <w:shd w:val="clear" w:fill="auto"/>
+        </w:rPr>
+      </w:pPr>
+      <w:r>
+        <w:rPr>
+          <w:rFonts w:hint="default" w:ascii="Calibri" w:hAnsi="Calibri" w:eastAsia="Calibri"/>
+          <w:color w:val="auto"/>
+          <w:spacing w:val="0"/>
+          <w:position w:val="0"/>
+          <w:sz w:val="28"/>
+          <w:szCs w:val="22"/>
+          <w:shd w:val="clear" w:fill="auto"/>
+        </w:rPr>
+        <w:t>Integrating email services with web applications via API.</w:t>
+      </w:r>
+    </w:p>
+    <w:p>
+      <w:pPr>
+        <w:spacing w:before="0" w:after="200" w:line="276" w:lineRule="auto"/>
+        <w:ind w:left="0" w:right="0" w:firstLine="0"/>
+        <w:jc w:val="left"/>
+        <w:rPr>
+          <w:rFonts w:ascii="Calibri" w:hAnsi="Calibri" w:eastAsia="Calibri" w:cs="Calibri"/>
+          <w:color w:val="auto"/>
+          <w:spacing w:val="0"/>
+          <w:position w:val="0"/>
+          <w:sz w:val="22"/>
+          <w:shd w:val="clear" w:fill="auto"/>
+        </w:rPr>
+      </w:pPr>
+    </w:p>
+    <w:p>
+      <w:pPr>
+        <w:spacing w:before="0" w:after="200" w:line="276" w:lineRule="auto"/>
+        <w:ind w:left="0" w:right="0" w:firstLine="0"/>
+        <w:jc w:val="left"/>
+        <w:rPr>
+          <w:rFonts w:ascii="Calibri" w:hAnsi="Calibri" w:eastAsia="Calibri" w:cs="Calibri"/>
+          <w:color w:val="auto"/>
+          <w:spacing w:val="0"/>
+          <w:position w:val="0"/>
+          <w:sz w:val="40"/>
+          <w:szCs w:val="40"/>
+          <w:shd w:val="clear" w:fill="auto"/>
+        </w:rPr>
+      </w:pPr>
+      <w:r>
+        <w:rPr>
+          <w:rFonts w:ascii="SimSun" w:hAnsi="SimSun" w:eastAsia="SimSun" w:cs="SimSun"/>
+          <w:sz w:val="24"/>
+          <w:szCs w:val="24"/>
+        </w:rPr>
+        <w:drawing>
+          <wp:anchor distT="0" distB="0" distL="114300" distR="114300" simplePos="0" relativeHeight="251672576" behindDoc="0" locked="0" layoutInCell="1" allowOverlap="1">
+            <wp:simplePos x="0" y="0"/>
+            <wp:positionH relativeFrom="column">
+              <wp:posOffset>4116070</wp:posOffset>
+            </wp:positionH>
+            <wp:positionV relativeFrom="paragraph">
+              <wp:posOffset>6985</wp:posOffset>
+            </wp:positionV>
+            <wp:extent cx="2593975" cy="592455"/>
+            <wp:effectExtent l="0" t="0" r="15875" b="17145"/>
+            <wp:wrapSquare wrapText="bothSides"/>
+            <wp:docPr id="11" name="Picture 2" descr="IMG_256"/>
+            <wp:cNvGraphicFramePr>
+              <a:graphicFrameLocks xmlns:a="http://schemas.openxmlformats.org/drawingml/2006/main" noChangeAspect="1"/>
+            </wp:cNvGraphicFramePr>
+            <a:graphic xmlns:a="http://schemas.openxmlformats.org/drawingml/2006/main">
+              <a:graphicData uri="http://schemas.openxmlformats.org/drawingml/2006/picture">
+                <pic:pic xmlns:pic="http://schemas.openxmlformats.org/drawingml/2006/picture">
+                  <pic:nvPicPr>
+                    <pic:cNvPr id="11" name="Picture 2" descr="IMG_256"/>
+                    <pic:cNvPicPr>
+                      <a:picLocks noChangeAspect="1"/>
+                    </pic:cNvPicPr>
+                  </pic:nvPicPr>
+                  <pic:blipFill>
+                    <a:blip r:embed="rId16"/>
+                    <a:stretch>
+                      <a:fillRect/>
+                    </a:stretch>
+                  </pic:blipFill>
+                  <pic:spPr>
+                    <a:xfrm>
+                      <a:off x="0" y="0"/>
+                      <a:ext cx="2593975" cy="592455"/>
+                    </a:xfrm>
+                    <a:prstGeom prst="rect">
+                      <a:avLst/>
+                    </a:prstGeom>
+                    <a:noFill/>
+                    <a:ln w="9525">
+                      <a:noFill/>
+                    </a:ln>
+                  </pic:spPr>
+                </pic:pic>
+              </a:graphicData>
+            </a:graphic>
+          </wp:anchor>
+        </w:drawing>
+      </w:r>
+      <w:r>
+        <w:rPr>
+          <w:rFonts w:ascii="Calibri" w:hAnsi="Calibri" w:eastAsia="Calibri" w:cs="Calibri"/>
+          <w:b/>
+          <w:bCs/>
+          <w:color w:val="auto"/>
+          <w:spacing w:val="0"/>
+          <w:position w:val="0"/>
+          <w:sz w:val="40"/>
+          <w:szCs w:val="40"/>
+          <w:shd w:val="clear" w:fill="auto"/>
+        </w:rPr>
+        <w:t>PayMob</w:t>
+      </w:r>
+      <w:r>
+        <w:rPr>
+          <w:rFonts w:hint="default" w:ascii="Calibri" w:hAnsi="Calibri" w:eastAsia="Calibri" w:cs="Calibri"/>
+          <w:b/>
+          <w:bCs/>
+          <w:color w:val="auto"/>
+          <w:spacing w:val="0"/>
+          <w:position w:val="0"/>
+          <w:sz w:val="40"/>
+          <w:szCs w:val="40"/>
+          <w:shd w:val="clear" w:fill="auto"/>
+          <w:lang w:val="en-US"/>
+        </w:rPr>
+        <w:t>:</w:t>
+      </w:r>
+      <w:r>
+        <w:rPr>
+          <w:rFonts w:ascii="Calibri" w:hAnsi="Calibri" w:eastAsia="Calibri" w:cs="Calibri"/>
+          <w:color w:val="auto"/>
+          <w:spacing w:val="0"/>
+          <w:position w:val="0"/>
+          <w:sz w:val="40"/>
+          <w:szCs w:val="40"/>
+          <w:shd w:val="clear" w:fill="auto"/>
+        </w:rPr>
+        <w:t>Payment Gateway</w:t>
+      </w:r>
+    </w:p>
+    <w:p>
+      <w:pPr>
+        <w:spacing w:before="0" w:after="200" w:line="276" w:lineRule="auto"/>
+        <w:ind w:left="0" w:right="0" w:firstLine="0"/>
+        <w:jc w:val="left"/>
+        <w:rPr>
+          <w:rFonts w:ascii="Calibri" w:hAnsi="Calibri" w:eastAsia="Calibri" w:cs="Calibri"/>
+          <w:color w:val="auto"/>
+          <w:spacing w:val="0"/>
+          <w:position w:val="0"/>
+          <w:sz w:val="24"/>
+          <w:szCs w:val="21"/>
+          <w:shd w:val="clear" w:fill="auto"/>
+        </w:rPr>
+      </w:pPr>
+      <w:r>
+        <w:rPr>
+          <w:rFonts w:ascii="Calibri" w:hAnsi="Calibri" w:eastAsia="Calibri" w:cs="Calibri"/>
+          <w:color w:val="auto"/>
+          <w:spacing w:val="0"/>
+          <w:position w:val="0"/>
+          <w:sz w:val="24"/>
+          <w:szCs w:val="21"/>
+          <w:shd w:val="clear" w:fill="auto"/>
+        </w:rPr>
+        <w:t>PayMob is a leading payment gateway in Egypt, designed to facilitate secure online transactions for businesses and consumers. It provides an API for processing payments, enabling businesses to accept payments via credit/debit cards, mobile wallets, and other local payment methods. PayMob is widely used by e-commerce businesses, subscription services, and retail merchants to offer a seamless and secure payment experience.</w:t>
+      </w:r>
+    </w:p>
+    <w:p>
+      <w:pPr>
+        <w:spacing w:before="0" w:after="200" w:line="276" w:lineRule="auto"/>
+        <w:ind w:left="0" w:right="0" w:firstLine="0"/>
+        <w:jc w:val="left"/>
+        <w:rPr>
+          <w:rFonts w:ascii="Calibri" w:hAnsi="Calibri" w:eastAsia="Calibri" w:cs="Calibri"/>
+          <w:color w:val="auto"/>
+          <w:spacing w:val="0"/>
+          <w:position w:val="0"/>
+          <w:sz w:val="24"/>
+          <w:szCs w:val="21"/>
+          <w:shd w:val="clear" w:fill="auto"/>
+        </w:rPr>
+      </w:pPr>
+    </w:p>
+    <w:p>
+      <w:pPr>
+        <w:spacing w:before="0" w:after="200" w:line="276" w:lineRule="auto"/>
+        <w:ind w:left="0" w:right="0" w:firstLine="0"/>
+        <w:jc w:val="left"/>
+        <w:rPr>
+          <w:rFonts w:ascii="Calibri" w:hAnsi="Calibri" w:eastAsia="Calibri" w:cs="Calibri"/>
+          <w:color w:val="auto"/>
+          <w:spacing w:val="0"/>
+          <w:position w:val="0"/>
+          <w:sz w:val="24"/>
+          <w:szCs w:val="21"/>
+          <w:shd w:val="clear" w:fill="auto"/>
+        </w:rPr>
+      </w:pPr>
+    </w:p>
+    <w:p>
+      <w:pPr>
+        <w:spacing w:before="0" w:after="200" w:line="276" w:lineRule="auto"/>
+        <w:ind w:left="0" w:right="0" w:firstLine="0"/>
+        <w:jc w:val="left"/>
+        <w:rPr>
+          <w:rFonts w:ascii="Calibri" w:hAnsi="Calibri" w:eastAsia="Calibri" w:cs="Calibri"/>
+          <w:b/>
+          <w:bCs/>
+          <w:color w:val="auto"/>
+          <w:spacing w:val="0"/>
+          <w:position w:val="0"/>
+          <w:sz w:val="24"/>
+          <w:szCs w:val="21"/>
+          <w:shd w:val="clear" w:fill="auto"/>
+        </w:rPr>
+      </w:pPr>
+      <w:r>
+        <w:rPr>
+          <w:rFonts w:ascii="Calibri" w:hAnsi="Calibri" w:eastAsia="Calibri" w:cs="Calibri"/>
+          <w:b/>
+          <w:bCs/>
+          <w:color w:val="auto"/>
+          <w:spacing w:val="0"/>
+          <w:position w:val="0"/>
+          <w:sz w:val="24"/>
+          <w:szCs w:val="21"/>
+          <w:shd w:val="clear" w:fill="auto"/>
+        </w:rPr>
+        <w:t>Key Features:</w:t>
+      </w:r>
+    </w:p>
+    <w:p>
+      <w:pPr>
+        <w:spacing w:before="0" w:after="200" w:line="276" w:lineRule="auto"/>
+        <w:ind w:left="0" w:right="0" w:firstLine="0"/>
+        <w:jc w:val="left"/>
+        <w:rPr>
+          <w:rFonts w:ascii="Calibri" w:hAnsi="Calibri" w:eastAsia="Calibri" w:cs="Calibri"/>
+          <w:color w:val="auto"/>
+          <w:spacing w:val="0"/>
+          <w:position w:val="0"/>
+          <w:sz w:val="28"/>
+          <w:szCs w:val="22"/>
+          <w:shd w:val="clear" w:fill="auto"/>
+        </w:rPr>
+      </w:pPr>
+      <w:r>
+        <w:rPr>
+          <w:rFonts w:ascii="Calibri" w:hAnsi="Calibri" w:eastAsia="Calibri" w:cs="Calibri"/>
+          <w:b/>
+          <w:bCs/>
+          <w:color w:val="auto"/>
+          <w:spacing w:val="0"/>
+          <w:position w:val="0"/>
+          <w:sz w:val="28"/>
+          <w:szCs w:val="22"/>
+          <w:shd w:val="clear" w:fill="auto"/>
+        </w:rPr>
+        <w:t>Payment Gateway API:</w:t>
+      </w:r>
+      <w:r>
+        <w:rPr>
+          <w:rFonts w:ascii="Calibri" w:hAnsi="Calibri" w:eastAsia="Calibri" w:cs="Calibri"/>
+          <w:color w:val="auto"/>
+          <w:spacing w:val="0"/>
+          <w:position w:val="0"/>
+          <w:sz w:val="28"/>
+          <w:szCs w:val="22"/>
+          <w:shd w:val="clear" w:fill="auto"/>
+        </w:rPr>
+        <w:t xml:space="preserve"> Allows businesses to process payments from customers via a wide range of local and international payment methods.</w:t>
+      </w:r>
+    </w:p>
+    <w:p>
+      <w:pPr>
+        <w:spacing w:before="0" w:after="200" w:line="276" w:lineRule="auto"/>
+        <w:ind w:left="0" w:right="0" w:firstLine="0"/>
+        <w:jc w:val="left"/>
+        <w:rPr>
+          <w:rFonts w:ascii="Calibri" w:hAnsi="Calibri" w:eastAsia="Calibri" w:cs="Calibri"/>
+          <w:color w:val="auto"/>
+          <w:spacing w:val="0"/>
+          <w:position w:val="0"/>
+          <w:sz w:val="28"/>
+          <w:szCs w:val="22"/>
+          <w:shd w:val="clear" w:fill="auto"/>
+        </w:rPr>
+      </w:pPr>
+      <w:r>
+        <w:rPr>
+          <w:rFonts w:ascii="Calibri" w:hAnsi="Calibri" w:eastAsia="Calibri" w:cs="Calibri"/>
+          <w:b/>
+          <w:bCs/>
+          <w:color w:val="auto"/>
+          <w:spacing w:val="0"/>
+          <w:position w:val="0"/>
+          <w:sz w:val="28"/>
+          <w:szCs w:val="22"/>
+          <w:shd w:val="clear" w:fill="auto"/>
+        </w:rPr>
+        <w:t>Mobile Wallet Integration:</w:t>
+      </w:r>
+      <w:r>
+        <w:rPr>
+          <w:rFonts w:ascii="Calibri" w:hAnsi="Calibri" w:eastAsia="Calibri" w:cs="Calibri"/>
+          <w:color w:val="auto"/>
+          <w:spacing w:val="0"/>
+          <w:position w:val="0"/>
+          <w:sz w:val="28"/>
+          <w:szCs w:val="22"/>
+          <w:shd w:val="clear" w:fill="auto"/>
+        </w:rPr>
+        <w:t xml:space="preserve"> Supports popular mobile wallets, including Fawry, Vodafone Cash, and others for easy mobile-based payments.</w:t>
+      </w:r>
+    </w:p>
+    <w:p>
+      <w:pPr>
+        <w:spacing w:before="0" w:after="200" w:line="276" w:lineRule="auto"/>
+        <w:ind w:left="0" w:right="0" w:firstLine="0"/>
+        <w:jc w:val="left"/>
+        <w:rPr>
+          <w:rFonts w:ascii="Calibri" w:hAnsi="Calibri" w:eastAsia="Calibri" w:cs="Calibri"/>
+          <w:color w:val="auto"/>
+          <w:spacing w:val="0"/>
+          <w:position w:val="0"/>
+          <w:sz w:val="28"/>
+          <w:szCs w:val="22"/>
+          <w:shd w:val="clear" w:fill="auto"/>
+        </w:rPr>
+      </w:pPr>
+      <w:r>
+        <w:rPr>
+          <w:rFonts w:ascii="Calibri" w:hAnsi="Calibri" w:eastAsia="Calibri" w:cs="Calibri"/>
+          <w:b/>
+          <w:bCs/>
+          <w:color w:val="auto"/>
+          <w:spacing w:val="0"/>
+          <w:position w:val="0"/>
+          <w:sz w:val="28"/>
+          <w:szCs w:val="22"/>
+          <w:shd w:val="clear" w:fill="auto"/>
+        </w:rPr>
+        <w:t>Recurring Payments:</w:t>
+      </w:r>
+      <w:r>
+        <w:rPr>
+          <w:rFonts w:ascii="Calibri" w:hAnsi="Calibri" w:eastAsia="Calibri" w:cs="Calibri"/>
+          <w:color w:val="auto"/>
+          <w:spacing w:val="0"/>
+          <w:position w:val="0"/>
+          <w:sz w:val="28"/>
+          <w:szCs w:val="22"/>
+          <w:shd w:val="clear" w:fill="auto"/>
+        </w:rPr>
+        <w:t xml:space="preserve"> Enables subscription-based services to collect payments on a regular basis.</w:t>
+      </w:r>
+    </w:p>
+    <w:p>
+      <w:pPr>
+        <w:spacing w:before="0" w:after="200" w:line="276" w:lineRule="auto"/>
+        <w:ind w:left="0" w:right="0" w:firstLine="0"/>
+        <w:jc w:val="left"/>
+        <w:rPr>
+          <w:rFonts w:ascii="Calibri" w:hAnsi="Calibri" w:eastAsia="Calibri" w:cs="Calibri"/>
+          <w:color w:val="auto"/>
+          <w:spacing w:val="0"/>
+          <w:position w:val="0"/>
+          <w:sz w:val="28"/>
+          <w:szCs w:val="22"/>
+          <w:shd w:val="clear" w:fill="auto"/>
+        </w:rPr>
+      </w:pPr>
+      <w:r>
+        <w:rPr>
+          <w:rFonts w:ascii="Calibri" w:hAnsi="Calibri" w:eastAsia="Calibri" w:cs="Calibri"/>
+          <w:b/>
+          <w:bCs/>
+          <w:color w:val="auto"/>
+          <w:spacing w:val="0"/>
+          <w:position w:val="0"/>
+          <w:sz w:val="28"/>
+          <w:szCs w:val="22"/>
+          <w:shd w:val="clear" w:fill="auto"/>
+        </w:rPr>
+        <w:t>Fraud Detection:</w:t>
+      </w:r>
+      <w:r>
+        <w:rPr>
+          <w:rFonts w:ascii="Calibri" w:hAnsi="Calibri" w:eastAsia="Calibri" w:cs="Calibri"/>
+          <w:color w:val="auto"/>
+          <w:spacing w:val="0"/>
+          <w:position w:val="0"/>
+          <w:sz w:val="28"/>
+          <w:szCs w:val="22"/>
+          <w:shd w:val="clear" w:fill="auto"/>
+        </w:rPr>
+        <w:t xml:space="preserve"> Provides advanced security features, including fraud prevention tools, to protect businesses from fraudulent transactions.</w:t>
+      </w:r>
+    </w:p>
+    <w:p>
+      <w:pPr>
+        <w:spacing w:before="0" w:after="200" w:line="276" w:lineRule="auto"/>
+        <w:ind w:left="0" w:right="0" w:firstLine="0"/>
+        <w:jc w:val="left"/>
+        <w:rPr>
+          <w:rFonts w:ascii="Calibri" w:hAnsi="Calibri" w:eastAsia="Calibri" w:cs="Calibri"/>
+          <w:color w:val="auto"/>
+          <w:spacing w:val="0"/>
+          <w:position w:val="0"/>
+          <w:sz w:val="28"/>
+          <w:szCs w:val="22"/>
+          <w:shd w:val="clear" w:fill="auto"/>
+        </w:rPr>
+      </w:pPr>
+      <w:r>
+        <w:rPr>
+          <w:rFonts w:ascii="Calibri" w:hAnsi="Calibri" w:eastAsia="Calibri" w:cs="Calibri"/>
+          <w:b/>
+          <w:bCs/>
+          <w:color w:val="auto"/>
+          <w:spacing w:val="0"/>
+          <w:position w:val="0"/>
+          <w:sz w:val="28"/>
+          <w:szCs w:val="22"/>
+          <w:shd w:val="clear" w:fill="auto"/>
+        </w:rPr>
+        <w:t xml:space="preserve">Invoicing: </w:t>
+      </w:r>
+      <w:r>
+        <w:rPr>
+          <w:rFonts w:ascii="Calibri" w:hAnsi="Calibri" w:eastAsia="Calibri" w:cs="Calibri"/>
+          <w:color w:val="auto"/>
+          <w:spacing w:val="0"/>
+          <w:position w:val="0"/>
+          <w:sz w:val="28"/>
+          <w:szCs w:val="22"/>
+          <w:shd w:val="clear" w:fill="auto"/>
+        </w:rPr>
+        <w:t>Facilitates generating and managing invoices directly from the PayMob platform.</w:t>
+      </w:r>
+    </w:p>
+    <w:p>
+      <w:pPr>
+        <w:spacing w:before="0" w:after="200" w:line="276" w:lineRule="auto"/>
+        <w:ind w:left="0" w:right="0" w:firstLine="0"/>
+        <w:jc w:val="left"/>
+        <w:rPr>
+          <w:rFonts w:ascii="Calibri" w:hAnsi="Calibri" w:eastAsia="Calibri" w:cs="Calibri"/>
+          <w:color w:val="auto"/>
+          <w:spacing w:val="0"/>
+          <w:position w:val="0"/>
+          <w:sz w:val="28"/>
+          <w:szCs w:val="22"/>
+          <w:shd w:val="clear" w:fill="auto"/>
+        </w:rPr>
+      </w:pPr>
+      <w:r>
+        <w:rPr>
+          <w:rFonts w:ascii="Calibri" w:hAnsi="Calibri" w:eastAsia="Calibri" w:cs="Calibri"/>
+          <w:b/>
+          <w:bCs/>
+          <w:color w:val="auto"/>
+          <w:spacing w:val="0"/>
+          <w:position w:val="0"/>
+          <w:sz w:val="28"/>
+          <w:szCs w:val="22"/>
+          <w:shd w:val="clear" w:fill="auto"/>
+        </w:rPr>
+        <w:t xml:space="preserve">Local Integration: </w:t>
+      </w:r>
+      <w:r>
+        <w:rPr>
+          <w:rFonts w:ascii="Calibri" w:hAnsi="Calibri" w:eastAsia="Calibri" w:cs="Calibri"/>
+          <w:color w:val="auto"/>
+          <w:spacing w:val="0"/>
+          <w:position w:val="0"/>
+          <w:sz w:val="28"/>
+          <w:szCs w:val="22"/>
+          <w:shd w:val="clear" w:fill="auto"/>
+        </w:rPr>
+        <w:t>Tailored specifically for the Egyptian market, with support for local banks and payment methods.</w:t>
+      </w:r>
+    </w:p>
+    <w:p>
+      <w:pPr>
+        <w:spacing w:before="0" w:after="200" w:line="276" w:lineRule="auto"/>
+        <w:ind w:left="0" w:right="0" w:firstLine="0"/>
+        <w:jc w:val="left"/>
+        <w:rPr>
+          <w:rFonts w:ascii="Calibri" w:hAnsi="Calibri" w:eastAsia="Calibri" w:cs="Calibri"/>
+          <w:b/>
+          <w:bCs/>
+          <w:color w:val="auto"/>
+          <w:spacing w:val="0"/>
+          <w:position w:val="0"/>
+          <w:sz w:val="28"/>
+          <w:szCs w:val="22"/>
+          <w:shd w:val="clear" w:fill="auto"/>
+        </w:rPr>
+      </w:pPr>
+      <w:r>
+        <w:rPr>
+          <w:rFonts w:ascii="Calibri" w:hAnsi="Calibri" w:eastAsia="Calibri" w:cs="Calibri"/>
+          <w:b/>
+          <w:bCs/>
+          <w:color w:val="auto"/>
+          <w:spacing w:val="0"/>
+          <w:position w:val="0"/>
+          <w:sz w:val="28"/>
+          <w:szCs w:val="22"/>
+          <w:shd w:val="clear" w:fill="auto"/>
+        </w:rPr>
+        <w:t>Use Cases:</w:t>
+      </w:r>
+    </w:p>
+    <w:p>
+      <w:pPr>
+        <w:spacing w:before="0" w:after="200" w:line="276" w:lineRule="auto"/>
+        <w:ind w:left="0" w:right="0" w:firstLine="0"/>
+        <w:jc w:val="left"/>
+        <w:rPr>
+          <w:rFonts w:ascii="Calibri" w:hAnsi="Calibri" w:eastAsia="Calibri" w:cs="Calibri"/>
+          <w:color w:val="auto"/>
+          <w:spacing w:val="0"/>
+          <w:position w:val="0"/>
+          <w:sz w:val="28"/>
+          <w:szCs w:val="22"/>
+          <w:shd w:val="clear" w:fill="auto"/>
+        </w:rPr>
+      </w:pPr>
+      <w:r>
+        <w:rPr>
+          <w:rFonts w:ascii="Calibri" w:hAnsi="Calibri" w:eastAsia="Calibri" w:cs="Calibri"/>
+          <w:color w:val="auto"/>
+          <w:spacing w:val="0"/>
+          <w:position w:val="0"/>
+          <w:sz w:val="28"/>
+          <w:szCs w:val="22"/>
+          <w:shd w:val="clear" w:fill="auto"/>
+        </w:rPr>
+        <w:t>Enabling e-commerce sites to accept payments securely.</w:t>
+      </w:r>
+    </w:p>
+    <w:p>
+      <w:pPr>
+        <w:spacing w:before="0" w:after="200" w:line="276" w:lineRule="auto"/>
+        <w:ind w:left="0" w:right="0" w:firstLine="0"/>
+        <w:jc w:val="left"/>
+        <w:rPr>
+          <w:rFonts w:ascii="Calibri" w:hAnsi="Calibri" w:eastAsia="Calibri" w:cs="Calibri"/>
+          <w:color w:val="auto"/>
+          <w:spacing w:val="0"/>
+          <w:position w:val="0"/>
+          <w:sz w:val="28"/>
+          <w:szCs w:val="22"/>
+          <w:shd w:val="clear" w:fill="auto"/>
+        </w:rPr>
+      </w:pPr>
+      <w:r>
+        <w:rPr>
+          <w:rFonts w:ascii="Calibri" w:hAnsi="Calibri" w:eastAsia="Calibri" w:cs="Calibri"/>
+          <w:color w:val="auto"/>
+          <w:spacing w:val="0"/>
+          <w:position w:val="0"/>
+          <w:sz w:val="28"/>
+          <w:szCs w:val="22"/>
+          <w:shd w:val="clear" w:fill="auto"/>
+        </w:rPr>
+        <w:t>Providing subscription-based businesses with recurring billing solutions.</w:t>
+      </w:r>
+    </w:p>
+    <w:p>
+      <w:pPr>
+        <w:spacing w:before="0" w:after="200" w:line="276" w:lineRule="auto"/>
+        <w:ind w:left="0" w:right="0" w:firstLine="0"/>
+        <w:jc w:val="left"/>
+        <w:rPr>
+          <w:rFonts w:ascii="Calibri" w:hAnsi="Calibri" w:eastAsia="Calibri" w:cs="Calibri"/>
+          <w:color w:val="auto"/>
+          <w:spacing w:val="0"/>
+          <w:position w:val="0"/>
+          <w:sz w:val="28"/>
+          <w:szCs w:val="22"/>
+          <w:shd w:val="clear" w:fill="auto"/>
+        </w:rPr>
+      </w:pPr>
+      <w:r>
+        <w:rPr>
+          <w:rFonts w:ascii="Calibri" w:hAnsi="Calibri" w:eastAsia="Calibri" w:cs="Calibri"/>
+          <w:color w:val="auto"/>
+          <w:spacing w:val="0"/>
+          <w:position w:val="0"/>
+          <w:sz w:val="28"/>
+          <w:szCs w:val="22"/>
+          <w:shd w:val="clear" w:fill="auto"/>
+        </w:rPr>
+        <w:t>Integrating mobile wallet payments for greater convenience.</w:t>
+      </w:r>
+    </w:p>
+    <w:p>
+      <w:pPr>
+        <w:spacing w:before="0" w:after="200" w:line="276" w:lineRule="auto"/>
+        <w:ind w:left="0" w:right="0" w:firstLine="0"/>
+        <w:jc w:val="left"/>
+        <w:rPr>
+          <w:rFonts w:ascii="Calibri" w:hAnsi="Calibri" w:eastAsia="Calibri" w:cs="Calibri"/>
+          <w:color w:val="auto"/>
+          <w:spacing w:val="0"/>
+          <w:position w:val="0"/>
+          <w:sz w:val="24"/>
+          <w:szCs w:val="21"/>
+          <w:shd w:val="clear" w:fill="auto"/>
+        </w:rPr>
+      </w:pPr>
+    </w:p>
+    <w:p>
+      <w:pPr>
+        <w:spacing w:before="0" w:after="200" w:line="276" w:lineRule="auto"/>
+        <w:ind w:left="0" w:right="0" w:firstLine="0"/>
+        <w:jc w:val="left"/>
+        <w:rPr>
+          <w:rFonts w:ascii="Calibri" w:hAnsi="Calibri" w:eastAsia="Calibri" w:cs="Calibri"/>
+          <w:color w:val="auto"/>
+          <w:spacing w:val="0"/>
+          <w:position w:val="0"/>
+          <w:sz w:val="44"/>
+          <w:shd w:val="clear" w:fill="auto"/>
+        </w:rPr>
+      </w:pPr>
+    </w:p>
+    <w:p>
+      <w:pPr>
+        <w:spacing w:before="0" w:after="200" w:line="276" w:lineRule="auto"/>
+        <w:ind w:left="0" w:right="0" w:firstLine="0"/>
+        <w:jc w:val="left"/>
+        <w:rPr>
+          <w:rFonts w:ascii="Calibri" w:hAnsi="Calibri" w:eastAsia="Calibri" w:cs="Calibri"/>
+          <w:color w:val="auto"/>
+          <w:spacing w:val="0"/>
+          <w:position w:val="0"/>
+          <w:sz w:val="28"/>
+          <w:szCs w:val="22"/>
+          <w:shd w:val="clear" w:fill="auto"/>
+        </w:rPr>
+      </w:pPr>
+      <w:r>
+        <w:rPr>
+          <w:rFonts w:ascii="Calibri" w:hAnsi="Calibri" w:eastAsia="Calibri" w:cs="Calibri"/>
+          <w:color w:val="auto"/>
+          <w:spacing w:val="0"/>
+          <w:position w:val="0"/>
+          <w:sz w:val="44"/>
+          <w:shd w:val="clear" w:fill="auto"/>
+        </w:rPr>
+        <w:t>Twilio</w:t>
+      </w:r>
+      <w:r>
+        <w:rPr>
+          <w:rFonts w:hint="default" w:ascii="Calibri" w:hAnsi="Calibri" w:eastAsia="Calibri" w:cs="Calibri"/>
+          <w:color w:val="auto"/>
+          <w:spacing w:val="0"/>
+          <w:position w:val="0"/>
+          <w:sz w:val="44"/>
+          <w:shd w:val="clear" w:fill="auto"/>
+          <w:lang w:val="en-US"/>
+        </w:rPr>
+        <w:t>:</w:t>
+      </w:r>
+      <w:r>
+        <w:rPr>
+          <w:rFonts w:ascii="Calibri" w:hAnsi="Calibri" w:eastAsia="Calibri" w:cs="Calibri"/>
+          <w:color w:val="auto"/>
+          <w:spacing w:val="0"/>
+          <w:position w:val="0"/>
+          <w:sz w:val="28"/>
+          <w:szCs w:val="22"/>
+          <w:shd w:val="clear" w:fill="auto"/>
+        </w:rPr>
+        <w:t>SMS Messaging API</w:t>
+      </w:r>
+    </w:p>
+    <w:p>
+      <w:pPr>
+        <w:spacing w:before="0" w:after="200" w:line="276" w:lineRule="auto"/>
+        <w:ind w:left="0" w:right="0" w:firstLine="0"/>
+        <w:jc w:val="left"/>
+        <w:rPr>
+          <w:rFonts w:ascii="Calibri" w:hAnsi="Calibri" w:eastAsia="Calibri" w:cs="Calibri"/>
+          <w:color w:val="auto"/>
+          <w:spacing w:val="0"/>
+          <w:position w:val="0"/>
+          <w:sz w:val="24"/>
+          <w:szCs w:val="21"/>
+          <w:shd w:val="clear" w:fill="auto"/>
+        </w:rPr>
+      </w:pPr>
+    </w:p>
+    <w:p>
+      <w:pPr>
+        <w:spacing w:before="0" w:after="200" w:line="276" w:lineRule="auto"/>
+        <w:ind w:left="0" w:right="0" w:firstLine="0"/>
+        <w:jc w:val="left"/>
+        <w:rPr>
+          <w:rFonts w:ascii="Calibri" w:hAnsi="Calibri" w:eastAsia="Calibri" w:cs="Calibri"/>
+          <w:color w:val="auto"/>
+          <w:spacing w:val="0"/>
+          <w:position w:val="0"/>
+          <w:sz w:val="24"/>
+          <w:szCs w:val="21"/>
+          <w:shd w:val="clear" w:fill="auto"/>
+        </w:rPr>
+      </w:pPr>
+      <w:r>
+        <w:rPr>
+          <w:rFonts w:ascii="Calibri" w:hAnsi="Calibri" w:eastAsia="Calibri" w:cs="Calibri"/>
+          <w:color w:val="auto"/>
+          <w:spacing w:val="0"/>
+          <w:position w:val="0"/>
+          <w:sz w:val="24"/>
+          <w:szCs w:val="21"/>
+          <w:shd w:val="clear" w:fill="auto"/>
+        </w:rPr>
+        <w:t>Overview:</w:t>
+      </w:r>
+    </w:p>
+    <w:p>
+      <w:pPr>
+        <w:spacing w:before="0" w:after="200" w:line="276" w:lineRule="auto"/>
+        <w:ind w:left="0" w:right="0" w:firstLine="0"/>
+        <w:jc w:val="left"/>
+        <w:rPr>
+          <w:rFonts w:ascii="Calibri" w:hAnsi="Calibri" w:eastAsia="Calibri" w:cs="Calibri"/>
+          <w:color w:val="auto"/>
+          <w:spacing w:val="0"/>
+          <w:position w:val="0"/>
+          <w:sz w:val="24"/>
+          <w:szCs w:val="21"/>
+          <w:shd w:val="clear" w:fill="auto"/>
+        </w:rPr>
+      </w:pPr>
+      <w:r>
+        <w:rPr>
+          <w:rFonts w:ascii="Calibri" w:hAnsi="Calibri" w:eastAsia="Calibri" w:cs="Calibri"/>
+          <w:color w:val="auto"/>
+          <w:spacing w:val="0"/>
+          <w:position w:val="0"/>
+          <w:sz w:val="24"/>
+          <w:szCs w:val="21"/>
+          <w:shd w:val="clear" w:fill="auto"/>
+        </w:rPr>
+        <w:t>Twilio provides a powerful SMS API for businesses to send and receive text messages globally. It allows seamless integration of SMS capabilities into web and mobile applications, enabling businesses to automate notifications, alerts, reminders, and two-way messaging. With robust scalability and reliable delivery, Twilio ensures effective communication for organizations of all sizes.</w:t>
+      </w:r>
+    </w:p>
+    <w:p>
+      <w:pPr>
+        <w:spacing w:before="0" w:after="200" w:line="276" w:lineRule="auto"/>
+        <w:ind w:left="0" w:right="0" w:firstLine="0"/>
+        <w:jc w:val="left"/>
+        <w:rPr>
+          <w:rFonts w:ascii="Calibri" w:hAnsi="Calibri" w:eastAsia="Calibri" w:cs="Calibri"/>
+          <w:color w:val="auto"/>
+          <w:spacing w:val="0"/>
+          <w:position w:val="0"/>
+          <w:sz w:val="24"/>
+          <w:szCs w:val="21"/>
+          <w:shd w:val="clear" w:fill="auto"/>
+        </w:rPr>
+      </w:pPr>
+    </w:p>
+    <w:p>
+      <w:pPr>
+        <w:spacing w:before="0" w:after="200" w:line="276" w:lineRule="auto"/>
+        <w:ind w:left="0" w:right="0" w:firstLine="0"/>
+        <w:jc w:val="left"/>
+        <w:rPr>
+          <w:rFonts w:ascii="Calibri" w:hAnsi="Calibri" w:eastAsia="Calibri" w:cs="Calibri"/>
+          <w:color w:val="auto"/>
+          <w:spacing w:val="0"/>
+          <w:position w:val="0"/>
+          <w:sz w:val="24"/>
+          <w:szCs w:val="21"/>
+          <w:shd w:val="clear" w:fill="auto"/>
+        </w:rPr>
+      </w:pPr>
+      <w:r>
+        <w:rPr>
+          <w:rFonts w:ascii="Calibri" w:hAnsi="Calibri" w:eastAsia="Calibri" w:cs="Calibri"/>
+          <w:color w:val="auto"/>
+          <w:spacing w:val="0"/>
+          <w:position w:val="0"/>
+          <w:sz w:val="24"/>
+          <w:szCs w:val="21"/>
+          <w:shd w:val="clear" w:fill="auto"/>
+        </w:rPr>
+        <w:t>Key Features:</w:t>
+      </w:r>
+    </w:p>
+    <w:p>
+      <w:pPr>
+        <w:spacing w:before="0" w:after="200" w:line="276" w:lineRule="auto"/>
+        <w:ind w:left="0" w:right="0" w:firstLine="0"/>
+        <w:jc w:val="left"/>
+        <w:rPr>
+          <w:rFonts w:ascii="Calibri" w:hAnsi="Calibri" w:eastAsia="Calibri" w:cs="Calibri"/>
+          <w:color w:val="auto"/>
+          <w:spacing w:val="0"/>
+          <w:position w:val="0"/>
+          <w:sz w:val="24"/>
+          <w:szCs w:val="21"/>
+          <w:shd w:val="clear" w:fill="auto"/>
+        </w:rPr>
+      </w:pPr>
+      <w:r>
+        <w:rPr>
+          <w:rFonts w:ascii="Calibri" w:hAnsi="Calibri" w:eastAsia="Calibri" w:cs="Calibri"/>
+          <w:b/>
+          <w:bCs/>
+          <w:color w:val="auto"/>
+          <w:spacing w:val="0"/>
+          <w:position w:val="0"/>
+          <w:sz w:val="24"/>
+          <w:szCs w:val="21"/>
+          <w:shd w:val="clear" w:fill="auto"/>
+        </w:rPr>
+        <w:t>Send SMS:</w:t>
+      </w:r>
+      <w:r>
+        <w:rPr>
+          <w:rFonts w:ascii="Calibri" w:hAnsi="Calibri" w:eastAsia="Calibri" w:cs="Calibri"/>
+          <w:color w:val="auto"/>
+          <w:spacing w:val="0"/>
+          <w:position w:val="0"/>
+          <w:sz w:val="24"/>
+          <w:szCs w:val="21"/>
+          <w:shd w:val="clear" w:fill="auto"/>
+        </w:rPr>
+        <w:t xml:space="preserve"> Quickly send text messages to customers worldwide through a simple API.</w:t>
+      </w:r>
+    </w:p>
+    <w:p>
+      <w:pPr>
+        <w:spacing w:before="0" w:after="200" w:line="276" w:lineRule="auto"/>
+        <w:ind w:left="0" w:right="0" w:firstLine="0"/>
+        <w:jc w:val="left"/>
+        <w:rPr>
+          <w:rFonts w:ascii="Calibri" w:hAnsi="Calibri" w:eastAsia="Calibri" w:cs="Calibri"/>
+          <w:color w:val="auto"/>
+          <w:spacing w:val="0"/>
+          <w:position w:val="0"/>
+          <w:sz w:val="24"/>
+          <w:szCs w:val="21"/>
+          <w:shd w:val="clear" w:fill="auto"/>
+        </w:rPr>
+      </w:pPr>
+      <w:r>
+        <w:rPr>
+          <w:rFonts w:ascii="Calibri" w:hAnsi="Calibri" w:eastAsia="Calibri" w:cs="Calibri"/>
+          <w:b/>
+          <w:bCs/>
+          <w:color w:val="auto"/>
+          <w:spacing w:val="0"/>
+          <w:position w:val="0"/>
+          <w:sz w:val="24"/>
+          <w:szCs w:val="21"/>
+          <w:shd w:val="clear" w:fill="auto"/>
+        </w:rPr>
+        <w:t xml:space="preserve">Receive SMS: </w:t>
+      </w:r>
+      <w:r>
+        <w:rPr>
+          <w:rFonts w:ascii="Calibri" w:hAnsi="Calibri" w:eastAsia="Calibri" w:cs="Calibri"/>
+          <w:color w:val="auto"/>
+          <w:spacing w:val="0"/>
+          <w:position w:val="0"/>
+          <w:sz w:val="24"/>
+          <w:szCs w:val="21"/>
+          <w:shd w:val="clear" w:fill="auto"/>
+        </w:rPr>
+        <w:t>Enable two-way communication by receiving replies directly in your application.</w:t>
+      </w:r>
+    </w:p>
+    <w:p>
+      <w:pPr>
+        <w:spacing w:before="0" w:after="200" w:line="276" w:lineRule="auto"/>
+        <w:ind w:left="0" w:right="0" w:firstLine="0"/>
+        <w:jc w:val="left"/>
+        <w:rPr>
+          <w:rFonts w:ascii="Calibri" w:hAnsi="Calibri" w:eastAsia="Calibri" w:cs="Calibri"/>
+          <w:color w:val="auto"/>
+          <w:spacing w:val="0"/>
+          <w:position w:val="0"/>
+          <w:sz w:val="24"/>
+          <w:szCs w:val="21"/>
+          <w:shd w:val="clear" w:fill="auto"/>
+        </w:rPr>
+      </w:pPr>
+      <w:r>
+        <w:rPr>
+          <w:rFonts w:ascii="Calibri" w:hAnsi="Calibri" w:eastAsia="Calibri" w:cs="Calibri"/>
+          <w:b/>
+          <w:bCs/>
+          <w:color w:val="auto"/>
+          <w:spacing w:val="0"/>
+          <w:position w:val="0"/>
+          <w:sz w:val="24"/>
+          <w:szCs w:val="21"/>
+          <w:shd w:val="clear" w:fill="auto"/>
+        </w:rPr>
+        <w:t>Phone Number Management</w:t>
+      </w:r>
+      <w:r>
+        <w:rPr>
+          <w:rFonts w:ascii="Calibri" w:hAnsi="Calibri" w:eastAsia="Calibri" w:cs="Calibri"/>
+          <w:color w:val="auto"/>
+          <w:spacing w:val="0"/>
+          <w:position w:val="0"/>
+          <w:sz w:val="24"/>
+          <w:szCs w:val="21"/>
+          <w:shd w:val="clear" w:fill="auto"/>
+        </w:rPr>
+        <w:t>: Purchase, configure, and manage virtual phone numbers to customize messaging.</w:t>
+      </w:r>
+    </w:p>
+    <w:p>
+      <w:pPr>
+        <w:spacing w:before="0" w:after="200" w:line="276" w:lineRule="auto"/>
+        <w:ind w:left="0" w:right="0" w:firstLine="0"/>
+        <w:jc w:val="left"/>
+        <w:rPr>
+          <w:rFonts w:ascii="Calibri" w:hAnsi="Calibri" w:eastAsia="Calibri" w:cs="Calibri"/>
+          <w:color w:val="auto"/>
+          <w:spacing w:val="0"/>
+          <w:position w:val="0"/>
+          <w:sz w:val="24"/>
+          <w:szCs w:val="21"/>
+          <w:shd w:val="clear" w:fill="auto"/>
+        </w:rPr>
+      </w:pPr>
+      <w:r>
+        <w:rPr>
+          <w:rFonts w:ascii="Calibri" w:hAnsi="Calibri" w:eastAsia="Calibri" w:cs="Calibri"/>
+          <w:b/>
+          <w:bCs/>
+          <w:color w:val="auto"/>
+          <w:spacing w:val="0"/>
+          <w:position w:val="0"/>
+          <w:sz w:val="24"/>
+          <w:szCs w:val="21"/>
+          <w:shd w:val="clear" w:fill="auto"/>
+        </w:rPr>
+        <w:t>Global Reach:</w:t>
+      </w:r>
+      <w:r>
+        <w:rPr>
+          <w:rFonts w:ascii="Calibri" w:hAnsi="Calibri" w:eastAsia="Calibri" w:cs="Calibri"/>
+          <w:color w:val="auto"/>
+          <w:spacing w:val="0"/>
+          <w:position w:val="0"/>
+          <w:sz w:val="24"/>
+          <w:szCs w:val="21"/>
+          <w:shd w:val="clear" w:fill="auto"/>
+        </w:rPr>
+        <w:t xml:space="preserve"> Deliver SMS to over 180 countries with high reliability and fast delivery rates.</w:t>
+      </w:r>
+    </w:p>
+    <w:p>
+      <w:pPr>
+        <w:spacing w:before="0" w:after="200" w:line="276" w:lineRule="auto"/>
+        <w:ind w:left="0" w:right="0" w:firstLine="0"/>
+        <w:jc w:val="left"/>
+        <w:rPr>
+          <w:rFonts w:ascii="Calibri" w:hAnsi="Calibri" w:eastAsia="Calibri" w:cs="Calibri"/>
+          <w:color w:val="auto"/>
+          <w:spacing w:val="0"/>
+          <w:position w:val="0"/>
+          <w:sz w:val="24"/>
+          <w:szCs w:val="21"/>
+          <w:shd w:val="clear" w:fill="auto"/>
+        </w:rPr>
+      </w:pPr>
+      <w:r>
+        <w:rPr>
+          <w:rFonts w:ascii="Calibri" w:hAnsi="Calibri" w:eastAsia="Calibri" w:cs="Calibri"/>
+          <w:b/>
+          <w:bCs/>
+          <w:color w:val="auto"/>
+          <w:spacing w:val="0"/>
+          <w:position w:val="0"/>
+          <w:sz w:val="24"/>
+          <w:szCs w:val="21"/>
+          <w:shd w:val="clear" w:fill="auto"/>
+        </w:rPr>
+        <w:t>Programmable Messaging:</w:t>
+      </w:r>
+      <w:r>
+        <w:rPr>
+          <w:rFonts w:ascii="Calibri" w:hAnsi="Calibri" w:eastAsia="Calibri" w:cs="Calibri"/>
+          <w:color w:val="auto"/>
+          <w:spacing w:val="0"/>
+          <w:position w:val="0"/>
+          <w:sz w:val="24"/>
+          <w:szCs w:val="21"/>
+          <w:shd w:val="clear" w:fill="auto"/>
+        </w:rPr>
+        <w:t xml:space="preserve"> Personalize messages with templates and variables for tailored communication.</w:t>
+      </w:r>
+    </w:p>
+    <w:p>
+      <w:pPr>
+        <w:spacing w:before="0" w:after="200" w:line="276" w:lineRule="auto"/>
+        <w:ind w:left="0" w:right="0" w:firstLine="0"/>
+        <w:jc w:val="left"/>
+        <w:rPr>
+          <w:rFonts w:ascii="Calibri" w:hAnsi="Calibri" w:eastAsia="Calibri" w:cs="Calibri"/>
+          <w:color w:val="auto"/>
+          <w:spacing w:val="0"/>
+          <w:position w:val="0"/>
+          <w:sz w:val="24"/>
+          <w:szCs w:val="21"/>
+          <w:shd w:val="clear" w:fill="auto"/>
+        </w:rPr>
+      </w:pPr>
+      <w:r>
+        <w:rPr>
+          <w:rFonts w:ascii="Calibri" w:hAnsi="Calibri" w:eastAsia="Calibri" w:cs="Calibri"/>
+          <w:b/>
+          <w:bCs/>
+          <w:color w:val="auto"/>
+          <w:spacing w:val="0"/>
+          <w:position w:val="0"/>
+          <w:sz w:val="24"/>
+          <w:szCs w:val="21"/>
+          <w:shd w:val="clear" w:fill="auto"/>
+        </w:rPr>
+        <w:t>Delivery Status Tracking</w:t>
+      </w:r>
+      <w:r>
+        <w:rPr>
+          <w:rFonts w:ascii="Calibri" w:hAnsi="Calibri" w:eastAsia="Calibri" w:cs="Calibri"/>
+          <w:color w:val="auto"/>
+          <w:spacing w:val="0"/>
+          <w:position w:val="0"/>
+          <w:sz w:val="24"/>
+          <w:szCs w:val="21"/>
+          <w:shd w:val="clear" w:fill="auto"/>
+        </w:rPr>
+        <w:t>: Monitor the status of sent messages with detailed delivery reports.</w:t>
+      </w:r>
+    </w:p>
+    <w:p>
+      <w:pPr>
+        <w:spacing w:before="0" w:after="200" w:line="276" w:lineRule="auto"/>
+        <w:ind w:left="0" w:right="0" w:firstLine="0"/>
+        <w:jc w:val="left"/>
+        <w:rPr>
+          <w:rFonts w:ascii="Calibri" w:hAnsi="Calibri" w:eastAsia="Calibri" w:cs="Calibri"/>
+          <w:color w:val="auto"/>
+          <w:spacing w:val="0"/>
+          <w:position w:val="0"/>
+          <w:sz w:val="24"/>
+          <w:szCs w:val="21"/>
+          <w:shd w:val="clear" w:fill="auto"/>
+        </w:rPr>
+      </w:pPr>
+      <w:r>
+        <w:rPr>
+          <w:rFonts w:ascii="Calibri" w:hAnsi="Calibri" w:eastAsia="Calibri" w:cs="Calibri"/>
+          <w:b/>
+          <w:bCs/>
+          <w:color w:val="auto"/>
+          <w:spacing w:val="0"/>
+          <w:position w:val="0"/>
+          <w:sz w:val="24"/>
+          <w:szCs w:val="21"/>
+          <w:shd w:val="clear" w:fill="auto"/>
+        </w:rPr>
+        <w:t>Scalability</w:t>
+      </w:r>
+      <w:r>
+        <w:rPr>
+          <w:rFonts w:ascii="Calibri" w:hAnsi="Calibri" w:eastAsia="Calibri" w:cs="Calibri"/>
+          <w:color w:val="auto"/>
+          <w:spacing w:val="0"/>
+          <w:position w:val="0"/>
+          <w:sz w:val="24"/>
+          <w:szCs w:val="21"/>
+          <w:shd w:val="clear" w:fill="auto"/>
+        </w:rPr>
+        <w:t>: Supports large-scale messaging for campaigns, promotions, or transactional alerts.</w:t>
+      </w:r>
+    </w:p>
+    <w:p>
+      <w:pPr>
+        <w:spacing w:before="0" w:after="200" w:line="276" w:lineRule="auto"/>
+        <w:ind w:left="0" w:right="0" w:firstLine="0"/>
+        <w:jc w:val="left"/>
+        <w:rPr>
+          <w:rFonts w:ascii="Calibri" w:hAnsi="Calibri" w:eastAsia="Calibri" w:cs="Calibri"/>
+          <w:color w:val="auto"/>
+          <w:spacing w:val="0"/>
+          <w:position w:val="0"/>
+          <w:sz w:val="24"/>
+          <w:szCs w:val="21"/>
+          <w:shd w:val="clear" w:fill="auto"/>
+        </w:rPr>
+      </w:pPr>
+      <w:r>
+        <w:rPr>
+          <w:rFonts w:ascii="Calibri" w:hAnsi="Calibri" w:eastAsia="Calibri" w:cs="Calibri"/>
+          <w:color w:val="auto"/>
+          <w:spacing w:val="0"/>
+          <w:position w:val="0"/>
+          <w:sz w:val="24"/>
+          <w:szCs w:val="21"/>
+          <w:shd w:val="clear" w:fill="auto"/>
+        </w:rPr>
+        <w:t>Use Cases:</w:t>
+      </w:r>
+    </w:p>
+    <w:p>
+      <w:pPr>
+        <w:spacing w:before="0" w:after="200" w:line="276" w:lineRule="auto"/>
+        <w:ind w:left="0" w:right="0" w:firstLine="0"/>
+        <w:jc w:val="left"/>
+        <w:rPr>
+          <w:rFonts w:ascii="Calibri" w:hAnsi="Calibri" w:eastAsia="Calibri" w:cs="Calibri"/>
+          <w:color w:val="auto"/>
+          <w:spacing w:val="0"/>
+          <w:position w:val="0"/>
+          <w:sz w:val="24"/>
+          <w:szCs w:val="21"/>
+          <w:shd w:val="clear" w:fill="auto"/>
+        </w:rPr>
+      </w:pPr>
+      <w:r>
+        <w:rPr>
+          <w:rFonts w:ascii="Calibri" w:hAnsi="Calibri" w:eastAsia="Calibri" w:cs="Calibri"/>
+          <w:color w:val="auto"/>
+          <w:spacing w:val="0"/>
+          <w:position w:val="0"/>
+          <w:sz w:val="24"/>
+          <w:szCs w:val="21"/>
+          <w:shd w:val="clear" w:fill="auto"/>
+        </w:rPr>
+        <w:t>Sending transactional messages like OTPs, confirmations, and alerts.</w:t>
+      </w:r>
+    </w:p>
+    <w:p>
+      <w:pPr>
+        <w:spacing w:before="0" w:after="200" w:line="276" w:lineRule="auto"/>
+        <w:ind w:left="0" w:right="0" w:firstLine="0"/>
+        <w:jc w:val="left"/>
+        <w:rPr>
+          <w:rFonts w:ascii="Calibri" w:hAnsi="Calibri" w:eastAsia="Calibri" w:cs="Calibri"/>
+          <w:color w:val="auto"/>
+          <w:spacing w:val="0"/>
+          <w:position w:val="0"/>
+          <w:sz w:val="24"/>
+          <w:szCs w:val="21"/>
+          <w:shd w:val="clear" w:fill="auto"/>
+        </w:rPr>
+      </w:pPr>
+      <w:r>
+        <w:rPr>
+          <w:rFonts w:ascii="Calibri" w:hAnsi="Calibri" w:eastAsia="Calibri" w:cs="Calibri"/>
+          <w:color w:val="auto"/>
+          <w:spacing w:val="0"/>
+          <w:position w:val="0"/>
+          <w:sz w:val="24"/>
+          <w:szCs w:val="21"/>
+          <w:shd w:val="clear" w:fill="auto"/>
+        </w:rPr>
+        <w:t>Running SMS-based marketing campaigns.</w:t>
+      </w:r>
+    </w:p>
+    <w:p>
+      <w:pPr>
+        <w:spacing w:before="0" w:after="200" w:line="276" w:lineRule="auto"/>
+        <w:ind w:left="0" w:right="0" w:firstLine="0"/>
+        <w:jc w:val="left"/>
+        <w:rPr>
+          <w:rFonts w:ascii="Calibri" w:hAnsi="Calibri" w:eastAsia="Calibri" w:cs="Calibri"/>
+          <w:color w:val="auto"/>
+          <w:spacing w:val="0"/>
+          <w:position w:val="0"/>
+          <w:sz w:val="24"/>
+          <w:szCs w:val="21"/>
+          <w:shd w:val="clear" w:fill="auto"/>
+        </w:rPr>
+      </w:pPr>
+      <w:r>
+        <w:rPr>
+          <w:rFonts w:ascii="Calibri" w:hAnsi="Calibri" w:eastAsia="Calibri" w:cs="Calibri"/>
+          <w:color w:val="auto"/>
+          <w:spacing w:val="0"/>
+          <w:position w:val="0"/>
+          <w:sz w:val="24"/>
+          <w:szCs w:val="21"/>
+          <w:shd w:val="clear" w:fill="auto"/>
+        </w:rPr>
+        <w:t>Automating customer notifications, reminders, and updates.</w:t>
+      </w:r>
+    </w:p>
+    <w:p>
+      <w:pPr>
+        <w:numPr>
+          <w:ilvl w:val="0"/>
           <w:numId w:val="0"/>
         </w:numPr>
         <w:ind w:leftChars="0"/>
@@ -5308,14 +6793,7 @@
           <w:lang w:val="en-US"/>
         </w:rPr>
       </w:pPr>
-    </w:p>
-    <w:p>
-      <w:pPr>
-        <w:numPr>
-          <w:numId w:val="0"/>
-        </w:numPr>
-        <w:ind w:leftChars="0"/>
-        <w:jc w:val="left"/>
+      <w:r>
         <w:rPr>
           <w:rFonts w:hint="default" w:ascii="Calibri" w:hAnsi="Calibri"/>
           <w:b/>
@@ -5324,41 +6802,13 @@
           <w:szCs w:val="36"/>
           <w:lang w:val="en-US"/>
         </w:rPr>
-      </w:pPr>
-    </w:p>
-    <w:p>
-      <w:pPr>
-        <w:numPr>
-          <w:numId w:val="0"/>
-        </w:numPr>
-        <w:ind w:leftChars="0"/>
-        <w:jc w:val="left"/>
-        <w:rPr>
-          <w:rFonts w:hint="default" w:ascii="Calibri" w:hAnsi="Calibri"/>
-          <w:b/>
-          <w:bCs/>
-          <w:sz w:val="36"/>
-          <w:szCs w:val="36"/>
-          <w:lang w:val="en-US"/>
-        </w:rPr>
-      </w:pPr>
-      <w:bookmarkStart w:id="0" w:name="_GoBack"/>
-      <w:bookmarkEnd w:id="0"/>
-      <w:r>
-        <w:rPr>
-          <w:rFonts w:hint="default" w:ascii="Calibri" w:hAnsi="Calibri"/>
-          <w:b/>
-          <w:bCs/>
-          <w:sz w:val="36"/>
-          <w:szCs w:val="36"/>
-          <w:lang w:val="en-US"/>
-        </w:rPr>
         <w:t>3.Machine Learning Model</w:t>
       </w:r>
     </w:p>
     <w:p>
       <w:pPr>
         <w:numPr>
+          <w:ilvl w:val="0"/>
           <w:numId w:val="0"/>
         </w:numPr>
         <w:jc w:val="left"/>
@@ -5427,7 +6877,7 @@
                     </pic:cNvPicPr>
                   </pic:nvPicPr>
                   <pic:blipFill>
-                    <a:blip r:embed="rId15"/>
+                    <a:blip r:embed="rId17"/>
                     <a:stretch>
                       <a:fillRect/>
                     </a:stretch>
@@ -5455,6 +6905,7 @@
     <w:p>
       <w:pPr>
         <w:numPr>
+          <w:ilvl w:val="0"/>
           <w:numId w:val="0"/>
         </w:numPr>
         <w:jc w:val="left"/>
@@ -5482,6 +6933,7 @@
     <w:p>
       <w:pPr>
         <w:numPr>
+          <w:ilvl w:val="0"/>
           <w:numId w:val="0"/>
         </w:numPr>
         <w:jc w:val="left"/>
@@ -5509,22 +6961,24 @@
     <w:p>
       <w:pPr>
         <w:numPr>
-          <w:numId w:val="0"/>
-        </w:numPr>
-        <w:jc w:val="left"/>
-        <w:rPr>
-          <w:rFonts w:hint="default" w:ascii="Calibri" w:hAnsi="Calibri"/>
-          <w:b w:val="0"/>
-          <w:bCs w:val="0"/>
-          <w:sz w:val="28"/>
-          <w:szCs w:val="28"/>
-          <w:lang w:val="en-US"/>
-        </w:rPr>
-      </w:pPr>
-    </w:p>
-    <w:p>
-      <w:pPr>
-        <w:numPr>
+          <w:ilvl w:val="0"/>
+          <w:numId w:val="0"/>
+        </w:numPr>
+        <w:jc w:val="left"/>
+        <w:rPr>
+          <w:rFonts w:hint="default" w:ascii="Calibri" w:hAnsi="Calibri"/>
+          <w:b w:val="0"/>
+          <w:bCs w:val="0"/>
+          <w:sz w:val="28"/>
+          <w:szCs w:val="28"/>
+          <w:lang w:val="en-US"/>
+        </w:rPr>
+      </w:pPr>
+    </w:p>
+    <w:p>
+      <w:pPr>
+        <w:numPr>
+          <w:ilvl w:val="0"/>
           <w:numId w:val="0"/>
         </w:numPr>
         <w:jc w:val="left"/>
@@ -5563,6 +7017,7 @@
     <w:p>
       <w:pPr>
         <w:numPr>
+          <w:ilvl w:val="0"/>
           <w:numId w:val="0"/>
         </w:numPr>
         <w:jc w:val="left"/>
@@ -5601,6 +7056,7 @@
     <w:p>
       <w:pPr>
         <w:numPr>
+          <w:ilvl w:val="0"/>
           <w:numId w:val="0"/>
         </w:numPr>
         <w:jc w:val="left"/>
@@ -5628,6 +7084,7 @@
     <w:p>
       <w:pPr>
         <w:numPr>
+          <w:ilvl w:val="0"/>
           <w:numId w:val="0"/>
         </w:numPr>
         <w:jc w:val="left"/>
@@ -5655,92 +7112,86 @@
     <w:p>
       <w:pPr>
         <w:numPr>
-          <w:numId w:val="0"/>
-        </w:numPr>
-        <w:jc w:val="left"/>
-        <w:rPr>
-          <w:rFonts w:hint="default" w:ascii="Calibri" w:hAnsi="Calibri"/>
-          <w:b w:val="0"/>
-          <w:bCs w:val="0"/>
-          <w:sz w:val="28"/>
-          <w:szCs w:val="28"/>
-          <w:lang w:val="en-US"/>
-        </w:rPr>
-      </w:pPr>
-    </w:p>
-    <w:p>
-      <w:pPr>
-        <w:numPr>
-          <w:numId w:val="0"/>
-        </w:numPr>
-        <w:jc w:val="left"/>
-        <w:rPr>
-          <w:rFonts w:hint="default" w:ascii="Calibri" w:hAnsi="Calibri"/>
-          <w:b w:val="0"/>
-          <w:bCs w:val="0"/>
-          <w:sz w:val="28"/>
-          <w:szCs w:val="28"/>
-          <w:lang w:val="en-US"/>
-        </w:rPr>
-      </w:pPr>
-    </w:p>
-    <w:p>
-      <w:pPr>
-        <w:numPr>
-          <w:numId w:val="0"/>
-        </w:numPr>
-        <w:jc w:val="left"/>
-        <w:rPr>
-          <w:rFonts w:hint="default" w:ascii="Calibri" w:hAnsi="Calibri"/>
-          <w:b w:val="0"/>
-          <w:bCs w:val="0"/>
-          <w:sz w:val="28"/>
-          <w:szCs w:val="28"/>
-          <w:lang w:val="en-US"/>
-        </w:rPr>
-      </w:pPr>
-    </w:p>
-    <w:p>
-      <w:pPr>
-        <w:numPr>
-          <w:numId w:val="0"/>
-        </w:numPr>
-        <w:jc w:val="left"/>
-        <w:rPr>
-          <w:rFonts w:hint="default" w:ascii="Calibri" w:hAnsi="Calibri"/>
-          <w:b/>
-          <w:bCs/>
-          <w:sz w:val="28"/>
-          <w:szCs w:val="28"/>
-          <w:lang w:val="en-US"/>
-        </w:rPr>
-      </w:pPr>
-      <w:r>
-        <w:rPr>
-          <w:rFonts w:hint="default" w:ascii="Calibri" w:hAnsi="Calibri"/>
-          <w:b/>
-          <w:bCs/>
-          <w:sz w:val="28"/>
-          <w:szCs w:val="28"/>
-          <w:lang w:val="en-US"/>
-        </w:rPr>
-        <w:t xml:space="preserve">2. </w:t>
-      </w:r>
-      <w:r>
-        <w:rPr>
-          <w:rFonts w:hint="default" w:ascii="Calibri" w:hAnsi="Calibri"/>
-          <w:b/>
-          <w:bCs/>
-          <w:sz w:val="28"/>
-          <w:szCs w:val="28"/>
-          <w:lang w:val="en-US"/>
-        </w:rPr>
-        <w:t>TensorFlow</w:t>
-      </w:r>
-    </w:p>
-    <w:p>
-      <w:pPr>
-        <w:numPr>
+          <w:ilvl w:val="0"/>
+          <w:numId w:val="0"/>
+        </w:numPr>
+        <w:jc w:val="left"/>
+        <w:rPr>
+          <w:rFonts w:hint="default" w:ascii="Calibri" w:hAnsi="Calibri"/>
+          <w:b w:val="0"/>
+          <w:bCs w:val="0"/>
+          <w:sz w:val="28"/>
+          <w:szCs w:val="28"/>
+          <w:lang w:val="en-US"/>
+        </w:rPr>
+      </w:pPr>
+    </w:p>
+    <w:p>
+      <w:pPr>
+        <w:numPr>
+          <w:ilvl w:val="0"/>
+          <w:numId w:val="0"/>
+        </w:numPr>
+        <w:jc w:val="left"/>
+        <w:rPr>
+          <w:rFonts w:hint="default" w:ascii="Calibri" w:hAnsi="Calibri"/>
+          <w:b w:val="0"/>
+          <w:bCs w:val="0"/>
+          <w:sz w:val="28"/>
+          <w:szCs w:val="28"/>
+          <w:lang w:val="en-US"/>
+        </w:rPr>
+      </w:pPr>
+    </w:p>
+    <w:p>
+      <w:pPr>
+        <w:numPr>
+          <w:ilvl w:val="0"/>
+          <w:numId w:val="0"/>
+        </w:numPr>
+        <w:jc w:val="left"/>
+        <w:rPr>
+          <w:rFonts w:hint="default" w:ascii="Calibri" w:hAnsi="Calibri"/>
+          <w:b w:val="0"/>
+          <w:bCs w:val="0"/>
+          <w:sz w:val="28"/>
+          <w:szCs w:val="28"/>
+          <w:lang w:val="en-US"/>
+        </w:rPr>
+      </w:pPr>
+    </w:p>
+    <w:p>
+      <w:pPr>
+        <w:numPr>
+          <w:ilvl w:val="0"/>
+          <w:numId w:val="0"/>
+        </w:numPr>
+        <w:jc w:val="left"/>
+        <w:rPr>
+          <w:rFonts w:hint="default" w:ascii="Calibri" w:hAnsi="Calibri"/>
+          <w:b/>
+          <w:bCs/>
+          <w:sz w:val="28"/>
+          <w:szCs w:val="28"/>
+          <w:lang w:val="en-US"/>
+        </w:rPr>
+      </w:pPr>
+      <w:r>
+        <w:rPr>
+          <w:rFonts w:hint="default" w:ascii="Calibri" w:hAnsi="Calibri"/>
+          <w:b/>
+          <w:bCs/>
+          <w:sz w:val="28"/>
+          <w:szCs w:val="28"/>
+          <w:lang w:val="en-US"/>
+        </w:rPr>
+        <w:t>2. TensorFlow</w:t>
+      </w:r>
+    </w:p>
+    <w:p>
+      <w:pPr>
+        <w:numPr>
+          <w:ilvl w:val="0"/>
           <w:numId w:val="0"/>
         </w:numPr>
         <w:jc w:val="left"/>
@@ -5803,7 +7254,7 @@
                     </pic:cNvPicPr>
                   </pic:nvPicPr>
                   <pic:blipFill>
-                    <a:blip r:embed="rId16"/>
+                    <a:blip r:embed="rId18"/>
                     <a:stretch>
                       <a:fillRect/>
                     </a:stretch>
@@ -5842,22 +7293,24 @@
     <w:p>
       <w:pPr>
         <w:numPr>
-          <w:numId w:val="0"/>
-        </w:numPr>
-        <w:jc w:val="left"/>
-        <w:rPr>
-          <w:rFonts w:hint="default" w:ascii="Calibri" w:hAnsi="Calibri"/>
-          <w:b w:val="0"/>
-          <w:bCs w:val="0"/>
-          <w:sz w:val="28"/>
-          <w:szCs w:val="28"/>
-          <w:lang w:val="en-US"/>
-        </w:rPr>
-      </w:pPr>
-    </w:p>
-    <w:p>
-      <w:pPr>
-        <w:numPr>
+          <w:ilvl w:val="0"/>
+          <w:numId w:val="0"/>
+        </w:numPr>
+        <w:jc w:val="left"/>
+        <w:rPr>
+          <w:rFonts w:hint="default" w:ascii="Calibri" w:hAnsi="Calibri"/>
+          <w:b w:val="0"/>
+          <w:bCs w:val="0"/>
+          <w:sz w:val="28"/>
+          <w:szCs w:val="28"/>
+          <w:lang w:val="en-US"/>
+        </w:rPr>
+      </w:pPr>
+    </w:p>
+    <w:p>
+      <w:pPr>
+        <w:numPr>
+          <w:ilvl w:val="0"/>
           <w:numId w:val="0"/>
         </w:numPr>
         <w:jc w:val="left"/>
@@ -5885,22 +7338,24 @@
     <w:p>
       <w:pPr>
         <w:numPr>
-          <w:numId w:val="0"/>
-        </w:numPr>
-        <w:jc w:val="left"/>
-        <w:rPr>
-          <w:rFonts w:hint="default" w:ascii="Calibri" w:hAnsi="Calibri"/>
-          <w:b w:val="0"/>
-          <w:bCs w:val="0"/>
-          <w:sz w:val="28"/>
-          <w:szCs w:val="28"/>
-          <w:lang w:val="en-US"/>
-        </w:rPr>
-      </w:pPr>
-    </w:p>
-    <w:p>
-      <w:pPr>
-        <w:numPr>
+          <w:ilvl w:val="0"/>
+          <w:numId w:val="0"/>
+        </w:numPr>
+        <w:jc w:val="left"/>
+        <w:rPr>
+          <w:rFonts w:hint="default" w:ascii="Calibri" w:hAnsi="Calibri"/>
+          <w:b w:val="0"/>
+          <w:bCs w:val="0"/>
+          <w:sz w:val="28"/>
+          <w:szCs w:val="28"/>
+          <w:lang w:val="en-US"/>
+        </w:rPr>
+      </w:pPr>
+    </w:p>
+    <w:p>
+      <w:pPr>
+        <w:numPr>
+          <w:ilvl w:val="0"/>
           <w:numId w:val="0"/>
         </w:numPr>
         <w:jc w:val="left"/>
@@ -5928,6 +7383,7 @@
     <w:p>
       <w:pPr>
         <w:numPr>
+          <w:ilvl w:val="0"/>
           <w:numId w:val="0"/>
         </w:numPr>
         <w:jc w:val="left"/>
@@ -5966,6 +7422,7 @@
     <w:p>
       <w:pPr>
         <w:numPr>
+          <w:ilvl w:val="0"/>
           <w:numId w:val="0"/>
         </w:numPr>
         <w:jc w:val="left"/>
@@ -5993,6 +7450,7 @@
     <w:p>
       <w:pPr>
         <w:numPr>
+          <w:ilvl w:val="0"/>
           <w:numId w:val="0"/>
         </w:numPr>
         <w:jc w:val="left"/>
@@ -6031,6 +7489,7 @@
     <w:p>
       <w:pPr>
         <w:numPr>
+          <w:ilvl w:val="0"/>
           <w:numId w:val="0"/>
         </w:numPr>
         <w:jc w:val="left"/>
@@ -6058,6 +7517,7 @@
     <w:p>
       <w:pPr>
         <w:numPr>
+          <w:ilvl w:val="0"/>
           <w:numId w:val="0"/>
         </w:numPr>
         <w:jc w:val="left"/>
@@ -6085,22 +7545,24 @@
     <w:p>
       <w:pPr>
         <w:numPr>
-          <w:numId w:val="0"/>
-        </w:numPr>
-        <w:jc w:val="left"/>
-        <w:rPr>
-          <w:rFonts w:hint="default" w:ascii="Calibri" w:hAnsi="Calibri"/>
-          <w:b w:val="0"/>
-          <w:bCs w:val="0"/>
-          <w:sz w:val="28"/>
-          <w:szCs w:val="28"/>
-          <w:lang w:val="en-US"/>
-        </w:rPr>
-      </w:pPr>
-    </w:p>
-    <w:p>
-      <w:pPr>
-        <w:numPr>
+          <w:ilvl w:val="0"/>
+          <w:numId w:val="0"/>
+        </w:numPr>
+        <w:jc w:val="left"/>
+        <w:rPr>
+          <w:rFonts w:hint="default" w:ascii="Calibri" w:hAnsi="Calibri"/>
+          <w:b w:val="0"/>
+          <w:bCs w:val="0"/>
+          <w:sz w:val="28"/>
+          <w:szCs w:val="28"/>
+          <w:lang w:val="en-US"/>
+        </w:rPr>
+      </w:pPr>
+    </w:p>
+    <w:p>
+      <w:pPr>
+        <w:numPr>
+          <w:ilvl w:val="0"/>
           <w:numId w:val="0"/>
         </w:numPr>
         <w:jc w:val="left"/>
@@ -6128,6 +7590,7 @@
     <w:p>
       <w:pPr>
         <w:numPr>
+          <w:ilvl w:val="0"/>
           <w:numId w:val="0"/>
         </w:numPr>
         <w:jc w:val="left"/>
@@ -6166,6 +7629,7 @@
     <w:p>
       <w:pPr>
         <w:numPr>
+          <w:ilvl w:val="0"/>
           <w:numId w:val="0"/>
         </w:numPr>
         <w:jc w:val="left"/>
@@ -6204,6 +7668,7 @@
     <w:p>
       <w:pPr>
         <w:numPr>
+          <w:ilvl w:val="0"/>
           <w:numId w:val="0"/>
         </w:numPr>
         <w:jc w:val="left"/>
@@ -6242,6 +7707,41 @@
     <w:p>
       <w:pPr>
         <w:numPr>
+          <w:ilvl w:val="0"/>
+          <w:numId w:val="0"/>
+        </w:numPr>
+        <w:jc w:val="left"/>
+        <w:rPr>
+          <w:rFonts w:hint="default" w:ascii="Calibri" w:hAnsi="Calibri"/>
+          <w:b/>
+          <w:bCs/>
+          <w:sz w:val="36"/>
+          <w:szCs w:val="36"/>
+          <w:lang w:val="en-US"/>
+        </w:rPr>
+      </w:pPr>
+    </w:p>
+    <w:p>
+      <w:pPr>
+        <w:numPr>
+          <w:ilvl w:val="0"/>
+          <w:numId w:val="0"/>
+        </w:numPr>
+        <w:jc w:val="left"/>
+        <w:rPr>
+          <w:rFonts w:hint="default" w:ascii="Calibri" w:hAnsi="Calibri"/>
+          <w:b/>
+          <w:bCs/>
+          <w:sz w:val="36"/>
+          <w:szCs w:val="36"/>
+          <w:lang w:val="en-US"/>
+        </w:rPr>
+      </w:pPr>
+    </w:p>
+    <w:p>
+      <w:pPr>
+        <w:numPr>
+          <w:ilvl w:val="0"/>
           <w:numId w:val="0"/>
         </w:numPr>
         <w:jc w:val="left"/>

</xml_diff>